<commit_message>
docs: explain platform and execution for lesson 01 commands
</commit_message>
<xml_diff>
--- a/实操手册.docx
+++ b/实操手册.docx
@@ -54,7 +54,7 @@
       <w:r>
         <w:t xml:space="preserve">本课资源：</w:t>
       </w:r>
-      <w:hyperlink w:history="1" r:id="rIds9rnfzh8y5urlsy0mzchm">
+      <w:hyperlink w:history="1" r:id="rIdnvjqhlbwl15lwfknmbecl">
         <w:r>
           <w:rPr>
             <w:rStyle w:val="Hyperlink"/>
@@ -110,7 +110,7 @@
       <w:r>
         <w:t xml:space="preserve">首次准备：浏览器分别打开 </w:t>
       </w:r>
-      <w:hyperlink w:history="1" r:id="rIdp8xg6afwrotxafq2pfvw6">
+      <w:hyperlink w:history="1" r:id="rIdyzvi4usav3_5sktmz0lni">
         <w:r>
           <w:rPr>
             <w:rStyle w:val="Hyperlink"/>
@@ -121,7 +121,7 @@
       <w:r>
         <w:t xml:space="preserve">、</w:t>
       </w:r>
-      <w:hyperlink w:history="1" r:id="rIdu0_oiof-_f0tztef37mdq">
+      <w:hyperlink w:history="1" r:id="rId2cz82zorqvhjaikwvifjl">
         <w:r>
           <w:rPr>
             <w:rStyle w:val="Hyperlink"/>
@@ -132,7 +132,7 @@
       <w:r>
         <w:t xml:space="preserve">、</w:t>
       </w:r>
-      <w:hyperlink w:history="1" r:id="rIdpni2jn48xjukiompxmmm1">
+      <w:hyperlink w:history="1" r:id="rIdx-z9wbydi10ut9b3ozal8">
         <w:r>
           <w:rPr>
             <w:rStyle w:val="Hyperlink"/>
@@ -143,7 +143,7 @@
       <w:r>
         <w:t xml:space="preserve">，安装 Windows 版本。Git 安装时保留 Git Credential Manager；Node 选择 24 系列安装包。安装完关闭并重开 VS Code。GitHub 账号在 </w:t>
       </w:r>
-      <w:hyperlink w:history="1" r:id="rIdh_tub62qd8zyyqur7w77d">
+      <w:hyperlink w:history="1" r:id="rIdsn38rhboi7y-2rz_h11j-">
         <w:r>
           <w:rPr>
             <w:rStyle w:val="Hyperlink"/>
@@ -161,7 +161,51 @@
         <w:spacing w:after="90" w:before="90" w:line="290"/>
       </w:pPr>
       <w:r>
-        <w:t xml:space="preserve">按 Windows 键，搜索 Windows PowerShell，打开普通窗口。在其中依次检查：
+        <w:t xml:space="preserve">打开 VS Code，点击顶部“终端 → 新建终端”。如果终端名称不是 PowerShell，在终端右上方“+”旁的小箭头选择 PowerShell。没有打开工程也可以先领取资源。在下方终端依次检查：
+</w:t>
+      </w:r>
+    </w:p>
+    <w:p>
+      <w:pPr>
+        <w:spacing w:after="90" w:before="90" w:line="290"/>
+      </w:pPr>
+      <w:r>
+        <w:t xml:space="preserve">运行平台：Windows 10/11 · PowerShell。输入位置：VS Code 下方的 PowerShell 终端。
+</w:t>
+      </w:r>
+    </w:p>
+    <w:p>
+      <w:pPr>
+        <w:spacing w:after="90" w:before="90" w:line="290"/>
+      </w:pPr>
+      <w:r>
+        <w:t xml:space="preserve">当前目录：任意目录
+</w:t>
+      </w:r>
+    </w:p>
+    <w:p>
+      <w:pPr>
+        <w:spacing w:after="90" w:before="90" w:line="290"/>
+      </w:pPr>
+      <w:r>
+        <w:t xml:space="preserve">运行方法：点击终端最后一行，粘贴本代码框并按 Enter；# 开头是注释，可以一起复制。看到预期结果后再做下一步。
+</w:t>
+      </w:r>
+    </w:p>
+    <w:p>
+      <w:pPr>
+        <w:shd w:fill="F1F5F8" w:val="clear"/>
+        <w:spacing w:after="0" w:before="0" w:line="240"/>
+        <w:ind w:left="120"/>
+      </w:pPr>
+      <w:r>
+        <w:rPr>
+          <w:rFonts w:ascii="Consolas" w:eastAsia="Microsoft YaHei" w:hAnsi="Consolas"/>
+          <w:color w:val="123F51"/>
+          <w:sz w:val="18"/>
+          <w:szCs w:val="18"/>
+        </w:rPr>
+        <w:t xml:space="preserve"># 显示 Git 版本号，确认 Git 已安装。
 </w:t>
       </w:r>
     </w:p>
@@ -202,6 +246,50 @@
     </w:p>
     <w:p>
       <w:pPr>
+        <w:spacing w:after="90" w:before="90" w:line="290"/>
+      </w:pPr>
+      <w:r>
+        <w:t xml:space="preserve">运行平台：Windows 10/11 · PowerShell。输入位置：VS Code 下方的 PowerShell 终端。
+</w:t>
+      </w:r>
+    </w:p>
+    <w:p>
+      <w:pPr>
+        <w:spacing w:after="90" w:before="90" w:line="290"/>
+      </w:pPr>
+      <w:r>
+        <w:t xml:space="preserve">当前目录：任意目录
+</w:t>
+      </w:r>
+    </w:p>
+    <w:p>
+      <w:pPr>
+        <w:spacing w:after="90" w:before="90" w:line="290"/>
+      </w:pPr>
+      <w:r>
+        <w:t xml:space="preserve">运行方法：点击终端最后一行，粘贴本代码框并按 Enter；# 开头是注释，可以一起复制。看到预期结果后再做下一步。
+</w:t>
+      </w:r>
+    </w:p>
+    <w:p>
+      <w:pPr>
+        <w:shd w:fill="F1F5F8" w:val="clear"/>
+        <w:spacing w:after="0" w:before="0" w:line="240"/>
+        <w:ind w:left="120"/>
+      </w:pPr>
+      <w:r>
+        <w:rPr>
+          <w:rFonts w:ascii="Consolas" w:eastAsia="Microsoft YaHei" w:hAnsi="Consolas"/>
+          <w:color w:val="123F51"/>
+          <w:sz w:val="18"/>
+          <w:szCs w:val="18"/>
+        </w:rPr>
+        <w:t xml:space="preserve"># 显示 Node.js 版本号，本课程统一使用 v24。
+</w:t>
+      </w:r>
+    </w:p>
+    <w:p>
+      <w:pPr>
         <w:shd w:fill="F1F5F8" w:val="clear"/>
         <w:spacing w:after="0" w:before="0" w:line="240"/>
         <w:ind w:left="120"/>
@@ -237,6 +325,50 @@
     </w:p>
     <w:p>
       <w:pPr>
+        <w:spacing w:after="90" w:before="90" w:line="290"/>
+      </w:pPr>
+      <w:r>
+        <w:t xml:space="preserve">运行平台：Windows 10/11 · PowerShell。输入位置：VS Code 下方的 PowerShell 终端。
+</w:t>
+      </w:r>
+    </w:p>
+    <w:p>
+      <w:pPr>
+        <w:spacing w:after="90" w:before="90" w:line="290"/>
+      </w:pPr>
+      <w:r>
+        <w:t xml:space="preserve">当前目录：任意目录
+</w:t>
+      </w:r>
+    </w:p>
+    <w:p>
+      <w:pPr>
+        <w:spacing w:after="90" w:before="90" w:line="290"/>
+      </w:pPr>
+      <w:r>
+        <w:t xml:space="preserve">运行方法：点击终端最后一行，粘贴本代码框并按 Enter；# 开头是注释，可以一起复制。看到预期结果后再做下一步。
+</w:t>
+      </w:r>
+    </w:p>
+    <w:p>
+      <w:pPr>
+        <w:shd w:fill="F1F5F8" w:val="clear"/>
+        <w:spacing w:after="0" w:before="0" w:line="240"/>
+        <w:ind w:left="120"/>
+      </w:pPr>
+      <w:r>
+        <w:rPr>
+          <w:rFonts w:ascii="Consolas" w:eastAsia="Microsoft YaHei" w:hAnsi="Consolas"/>
+          <w:color w:val="123F51"/>
+          <w:sz w:val="18"/>
+          <w:szCs w:val="18"/>
+        </w:rPr>
+        <w:t xml:space="preserve"># 显示 npm 版本号；npm.cmd 是 Windows 的命令入口。
+</w:t>
+      </w:r>
+    </w:p>
+    <w:p>
+      <w:pPr>
         <w:shd w:fill="F1F5F8" w:val="clear"/>
         <w:spacing w:after="0" w:before="0" w:line="240"/>
         <w:ind w:left="120"/>
@@ -290,6 +422,50 @@
     </w:p>
     <w:p>
       <w:pPr>
+        <w:spacing w:after="90" w:before="90" w:line="290"/>
+      </w:pPr>
+      <w:r>
+        <w:t xml:space="preserve">运行平台：Windows 10/11 · PowerShell。输入位置：VS Code 下方的 PowerShell 终端。
+</w:t>
+      </w:r>
+    </w:p>
+    <w:p>
+      <w:pPr>
+        <w:spacing w:after="90" w:before="90" w:line="290"/>
+      </w:pPr>
+      <w:r>
+        <w:t xml:space="preserve">当前目录：任意目录
+</w:t>
+      </w:r>
+    </w:p>
+    <w:p>
+      <w:pPr>
+        <w:spacing w:after="90" w:before="90" w:line="290"/>
+      </w:pPr>
+      <w:r>
+        <w:t xml:space="preserve">运行方法：点击终端最后一行，粘贴本代码框并按 Enter；# 开头是注释，可以一起复制。看到预期结果后再做下一步。
+</w:t>
+      </w:r>
+    </w:p>
+    <w:p>
+      <w:pPr>
+        <w:shd w:fill="F1F5F8" w:val="clear"/>
+        <w:spacing w:after="0" w:before="0" w:line="240"/>
+        <w:ind w:left="120"/>
+      </w:pPr>
+      <w:r>
+        <w:rPr>
+          <w:rFonts w:ascii="Consolas" w:eastAsia="Microsoft YaHei" w:hAnsi="Consolas"/>
+          <w:color w:val="123F51"/>
+          <w:sz w:val="18"/>
+          <w:szCs w:val="18"/>
+        </w:rPr>
+        <w:t xml:space="preserve"># 确定工作目录：本人 Windows 用户文件夹下的 web-work。
+</w:t>
+      </w:r>
+    </w:p>
+    <w:p>
+      <w:pPr>
         <w:shd w:fill="F1F5F8" w:val="clear"/>
         <w:spacing w:after="0" w:before="0" w:line="240"/>
         <w:ind w:left="120"/>
@@ -316,6 +492,50 @@
     </w:p>
     <w:p>
       <w:pPr>
+        <w:spacing w:after="90" w:before="90" w:line="290"/>
+      </w:pPr>
+      <w:r>
+        <w:t xml:space="preserve">运行平台：Windows 10/11 · PowerShell。输入位置：VS Code 下方的 PowerShell 终端。
+</w:t>
+      </w:r>
+    </w:p>
+    <w:p>
+      <w:pPr>
+        <w:spacing w:after="90" w:before="90" w:line="290"/>
+      </w:pPr>
+      <w:r>
+        <w:t xml:space="preserve">当前目录：任意目录
+</w:t>
+      </w:r>
+    </w:p>
+    <w:p>
+      <w:pPr>
+        <w:spacing w:after="90" w:before="90" w:line="290"/>
+      </w:pPr>
+      <w:r>
+        <w:t xml:space="preserve">运行方法：点击终端最后一行，粘贴本代码框并按 Enter；# 开头是注释，可以一起复制。看到预期结果后再做下一步。
+</w:t>
+      </w:r>
+    </w:p>
+    <w:p>
+      <w:pPr>
+        <w:shd w:fill="F1F5F8" w:val="clear"/>
+        <w:spacing w:after="0" w:before="0" w:line="240"/>
+        <w:ind w:left="120"/>
+      </w:pPr>
+      <w:r>
+        <w:rPr>
+          <w:rFonts w:ascii="Consolas" w:eastAsia="Microsoft YaHei" w:hAnsi="Consolas"/>
+          <w:color w:val="123F51"/>
+          <w:sz w:val="18"/>
+          <w:szCs w:val="18"/>
+        </w:rPr>
+        <w:t xml:space="preserve"># 创建工作文件夹；Directory 表示文件夹，Force 在这里允许复用已有目录。
+</w:t>
+      </w:r>
+    </w:p>
+    <w:p>
+      <w:pPr>
         <w:shd w:fill="F1F5F8" w:val="clear"/>
         <w:spacing w:after="0" w:before="0" w:line="240"/>
         <w:ind w:left="120"/>
@@ -342,6 +562,50 @@
     </w:p>
     <w:p>
       <w:pPr>
+        <w:spacing w:after="90" w:before="90" w:line="290"/>
+      </w:pPr>
+      <w:r>
+        <w:t xml:space="preserve">运行平台：Windows 10/11 · PowerShell。输入位置：VS Code 下方的 PowerShell 终端。
+</w:t>
+      </w:r>
+    </w:p>
+    <w:p>
+      <w:pPr>
+        <w:spacing w:after="90" w:before="90" w:line="290"/>
+      </w:pPr>
+      <w:r>
+        <w:t xml:space="preserve">当前目录：当前目录可以任意；本代码框会切换到指定目录。
+</w:t>
+      </w:r>
+    </w:p>
+    <w:p>
+      <w:pPr>
+        <w:spacing w:after="90" w:before="90" w:line="290"/>
+      </w:pPr>
+      <w:r>
+        <w:t xml:space="preserve">运行方法：点击终端最后一行，粘贴本代码框并按 Enter；# 开头是注释，可以一起复制。看到预期结果后再做下一步。
+</w:t>
+      </w:r>
+    </w:p>
+    <w:p>
+      <w:pPr>
+        <w:shd w:fill="F1F5F8" w:val="clear"/>
+        <w:spacing w:after="0" w:before="0" w:line="240"/>
+        <w:ind w:left="120"/>
+      </w:pPr>
+      <w:r>
+        <w:rPr>
+          <w:rFonts w:ascii="Consolas" w:eastAsia="Microsoft YaHei" w:hAnsi="Consolas"/>
+          <w:color w:val="123F51"/>
+          <w:sz w:val="18"/>
+          <w:szCs w:val="18"/>
+        </w:rPr>
+        <w:t xml:space="preserve"># 进入指定文件夹，后面的命令将在这个目录里运行。
+</w:t>
+      </w:r>
+    </w:p>
+    <w:p>
+      <w:pPr>
         <w:shd w:fill="F1F5F8" w:val="clear"/>
         <w:spacing w:after="0" w:before="0" w:line="240"/>
         <w:ind w:left="120"/>
@@ -368,6 +632,50 @@
     </w:p>
     <w:p>
       <w:pPr>
+        <w:spacing w:after="90" w:before="90" w:line="290"/>
+      </w:pPr>
+      <w:r>
+        <w:t xml:space="preserve">运行平台：Windows 10/11 · PowerShell。输入位置：VS Code 下方的 PowerShell 终端。
+</w:t>
+      </w:r>
+    </w:p>
+    <w:p>
+      <w:pPr>
+        <w:spacing w:after="90" w:before="90" w:line="290"/>
+      </w:pPr>
+      <w:r>
+        <w:t xml:space="preserve">当前目录：本人用户目录下的 web-work
+</w:t>
+      </w:r>
+    </w:p>
+    <w:p>
+      <w:pPr>
+        <w:spacing w:after="90" w:before="90" w:line="290"/>
+      </w:pPr>
+      <w:r>
+        <w:t xml:space="preserve">运行方法：点击终端最后一行，粘贴本代码框并按 Enter；# 开头是注释，可以一起复制。看到预期结果后再做下一步。
+</w:t>
+      </w:r>
+    </w:p>
+    <w:p>
+      <w:pPr>
+        <w:shd w:fill="F1F5F8" w:val="clear"/>
+        <w:spacing w:after="0" w:before="0" w:line="240"/>
+        <w:ind w:left="120"/>
+      </w:pPr>
+      <w:r>
+        <w:rPr>
+          <w:rFonts w:ascii="Consolas" w:eastAsia="Microsoft YaHei" w:hAnsi="Consolas"/>
+          <w:color w:val="123F51"/>
+          <w:sz w:val="18"/>
+          <w:szCs w:val="18"/>
+        </w:rPr>
+        <w:t xml:space="preserve"># 保存老师的真实资源仓库地址，直接复制这一行。
+</w:t>
+      </w:r>
+    </w:p>
+    <w:p>
+      <w:pPr>
         <w:shd w:fill="F1F5F8" w:val="clear"/>
         <w:spacing w:after="0" w:before="0" w:line="240"/>
         <w:ind w:left="120"/>
@@ -394,6 +702,50 @@
     </w:p>
     <w:p>
       <w:pPr>
+        <w:spacing w:after="90" w:before="90" w:line="290"/>
+      </w:pPr>
+      <w:r>
+        <w:t xml:space="preserve">运行平台：Windows 10/11 · PowerShell。输入位置：VS Code 下方的 PowerShell 终端。
+</w:t>
+      </w:r>
+    </w:p>
+    <w:p>
+      <w:pPr>
+        <w:spacing w:after="90" w:before="90" w:line="290"/>
+      </w:pPr>
+      <w:r>
+        <w:t xml:space="preserve">当前目录：本人用户目录下的 web-work
+</w:t>
+      </w:r>
+    </w:p>
+    <w:p>
+      <w:pPr>
+        <w:spacing w:after="90" w:before="90" w:line="290"/>
+      </w:pPr>
+      <w:r>
+        <w:t xml:space="preserve">运行方法：点击终端最后一行，粘贴本代码框并按 Enter；# 开头是注释，可以一起复制。看到预期结果后再做下一步。
+</w:t>
+      </w:r>
+    </w:p>
+    <w:p>
+      <w:pPr>
+        <w:shd w:fill="F1F5F8" w:val="clear"/>
+        <w:spacing w:after="0" w:before="0" w:line="240"/>
+        <w:ind w:left="120"/>
+      </w:pPr>
+      <w:r>
+        <w:rPr>
+          <w:rFonts w:ascii="Consolas" w:eastAsia="Microsoft YaHei" w:hAnsi="Consolas"/>
+          <w:color w:val="123F51"/>
+          <w:sz w:val="18"/>
+          <w:szCs w:val="18"/>
+        </w:rPr>
+        <w:t xml:space="preserve"># 从远程下载指定仓库或课次分支；最后一个参数是电脑上的保存文件夹。
+</w:t>
+      </w:r>
+    </w:p>
+    <w:p>
+      <w:pPr>
         <w:shd w:fill="F1F5F8" w:val="clear"/>
         <w:spacing w:after="0" w:before="0" w:line="240"/>
         <w:ind w:left="120"/>
@@ -429,6 +781,50 @@
     </w:p>
     <w:p>
       <w:pPr>
+        <w:spacing w:after="90" w:before="90" w:line="290"/>
+      </w:pPr>
+      <w:r>
+        <w:t xml:space="preserve">运行平台：Windows 10/11 · PowerShell。输入位置：VS Code 下方的 PowerShell 终端。
+</w:t>
+      </w:r>
+    </w:p>
+    <w:p>
+      <w:pPr>
+        <w:spacing w:after="90" w:before="90" w:line="290"/>
+      </w:pPr>
+      <w:r>
+        <w:t xml:space="preserve">当前目录：本人用户目录下的 web-work
+</w:t>
+      </w:r>
+    </w:p>
+    <w:p>
+      <w:pPr>
+        <w:spacing w:after="90" w:before="90" w:line="290"/>
+      </w:pPr>
+      <w:r>
+        <w:t xml:space="preserve">运行方法：点击终端最后一行，粘贴本代码框并按 Enter；# 开头是注释，可以一起复制。看到预期结果后再做下一步。
+</w:t>
+      </w:r>
+    </w:p>
+    <w:p>
+      <w:pPr>
+        <w:shd w:fill="F1F5F8" w:val="clear"/>
+        <w:spacing w:after="0" w:before="0" w:line="240"/>
+        <w:ind w:left="120"/>
+      </w:pPr>
+      <w:r>
+        <w:rPr>
+          <w:rFonts w:ascii="Consolas" w:eastAsia="Microsoft YaHei" w:hAnsi="Consolas"/>
+          <w:color w:val="123F51"/>
+          <w:sz w:val="18"/>
+          <w:szCs w:val="18"/>
+        </w:rPr>
+        <w:t xml:space="preserve"># 检查路径是否存在，存在输出 True，不存在输出 False。
+</w:t>
+      </w:r>
+    </w:p>
+    <w:p>
+      <w:pPr>
         <w:shd w:fill="F1F5F8" w:val="clear"/>
         <w:spacing w:after="0" w:before="0" w:line="240"/>
         <w:ind w:left="120"/>
@@ -467,7 +863,7 @@
         <w:spacing w:after="90" w:before="90" w:line="290"/>
       </w:pPr>
       <w:r>
-        <w:t xml:space="preserve">若提示 destination path already exists：不要重复 clone，也不要删除文件。先核对现有 kit-01-v12 的 README；确实是本课资源时，直接使用它。需要更新手册可进入这个 kit 目录执行 git pull --ff-only，随后返回 web-work；这条更新操作只针对领取目录。
+        <w:t xml:space="preserve">若提示 destination path already exists：不要重复 clone，也不要删除文件。先核对现有 kit-01-v12 的 README；确实是本课资源时，直接使用它。需要更新资料时，先核对当前确实是领取目录，再按老师的资料更新说明操作；个人开发工程继续保留。
 </w:t>
       </w:r>
     </w:p>
@@ -500,6 +896,50 @@
     </w:p>
     <w:p>
       <w:pPr>
+        <w:spacing w:after="90" w:before="90" w:line="290"/>
+      </w:pPr>
+      <w:r>
+        <w:t xml:space="preserve">运行平台：Windows 10/11 · PowerShell。输入位置：VS Code 下方的 PowerShell 终端。
+</w:t>
+      </w:r>
+    </w:p>
+    <w:p>
+      <w:pPr>
+        <w:spacing w:after="90" w:before="90" w:line="290"/>
+      </w:pPr>
+      <w:r>
+        <w:t xml:space="preserve">当前目录：本人用户目录下的 web-work
+</w:t>
+      </w:r>
+    </w:p>
+    <w:p>
+      <w:pPr>
+        <w:spacing w:after="90" w:before="90" w:line="290"/>
+      </w:pPr>
+      <w:r>
+        <w:t xml:space="preserve">运行方法：点击终端最后一行，粘贴本代码框并按 Enter；# 开头是注释，可以一起复制。看到预期结果后再做下一步。
+</w:t>
+      </w:r>
+    </w:p>
+    <w:p>
+      <w:pPr>
+        <w:shd w:fill="F1F5F8" w:val="clear"/>
+        <w:spacing w:after="0" w:before="0" w:line="240"/>
+        <w:ind w:left="120"/>
+      </w:pPr>
+      <w:r>
+        <w:rPr>
+          <w:rFonts w:ascii="Consolas" w:eastAsia="Microsoft YaHei" w:hAnsi="Consolas"/>
+          <w:color w:val="123F51"/>
+          <w:sz w:val="18"/>
+          <w:szCs w:val="18"/>
+        </w:rPr>
+        <w:t xml:space="preserve"># 设置个人开发目录 p1-portfolio，与 kit 领取目录并列。
+</w:t>
+      </w:r>
+    </w:p>
+    <w:p>
+      <w:pPr>
         <w:shd w:fill="F1F5F8" w:val="clear"/>
         <w:spacing w:after="0" w:before="0" w:line="240"/>
         <w:ind w:left="120"/>
@@ -526,6 +966,50 @@
     </w:p>
     <w:p>
       <w:pPr>
+        <w:spacing w:after="90" w:before="90" w:line="290"/>
+      </w:pPr>
+      <w:r>
+        <w:t xml:space="preserve">运行平台：Windows 10/11 · PowerShell。输入位置：VS Code 下方的 PowerShell 终端。
+</w:t>
+      </w:r>
+    </w:p>
+    <w:p>
+      <w:pPr>
+        <w:spacing w:after="90" w:before="90" w:line="290"/>
+      </w:pPr>
+      <w:r>
+        <w:t xml:space="preserve">当前目录：本人用户目录下的 web-work
+</w:t>
+      </w:r>
+    </w:p>
+    <w:p>
+      <w:pPr>
+        <w:spacing w:after="90" w:before="90" w:line="290"/>
+      </w:pPr>
+      <w:r>
+        <w:t xml:space="preserve">运行方法：点击终端最后一行，粘贴本代码框并按 Enter；# 开头是注释，可以一起复制。看到预期结果后再做下一步。
+</w:t>
+      </w:r>
+    </w:p>
+    <w:p>
+      <w:pPr>
+        <w:shd w:fill="F1F5F8" w:val="clear"/>
+        <w:spacing w:after="0" w:before="0" w:line="240"/>
+        <w:ind w:left="120"/>
+      </w:pPr>
+      <w:r>
+        <w:rPr>
+          <w:rFonts w:ascii="Consolas" w:eastAsia="Microsoft YaHei" w:hAnsi="Consolas"/>
+          <w:color w:val="123F51"/>
+          <w:sz w:val="18"/>
+          <w:szCs w:val="18"/>
+        </w:rPr>
+        <w:t xml:space="preserve"># 检查前提；不满足时停止当前步骤，避免覆盖已有成果。
+</w:t>
+      </w:r>
+    </w:p>
+    <w:p>
+      <w:pPr>
         <w:shd w:fill="F1F5F8" w:val="clear"/>
         <w:spacing w:after="0" w:before="0" w:line="240"/>
         <w:ind w:left="120"/>
@@ -554,6 +1038,23 @@
           <w:sz w:val="18"/>
           <w:szCs w:val="18"/>
         </w:rPr>
+        <w:t xml:space="preserve">  # 显示原因并停止当前代码块；先处理这个原因再往后做。
+</w:t>
+      </w:r>
+    </w:p>
+    <w:p>
+      <w:pPr>
+        <w:shd w:fill="F1F5F8" w:val="clear"/>
+        <w:spacing w:after="0" w:before="0" w:line="240"/>
+        <w:ind w:left="120"/>
+      </w:pPr>
+      <w:r>
+        <w:rPr>
+          <w:rFonts w:ascii="Consolas" w:eastAsia="Microsoft YaHei" w:hAnsi="Consolas"/>
+          <w:color w:val="123F51"/>
+          <w:sz w:val="18"/>
+          <w:szCs w:val="18"/>
+        </w:rPr>
         <w:t xml:space="preserve">  throw '个人项目已经存在：停止复制，打开原项目继续。'
 </w:t>
       </w:r>
@@ -588,6 +1089,23 @@
           <w:sz w:val="18"/>
           <w:szCs w:val="18"/>
         </w:rPr>
+        <w:t xml:space="preserve">  # 复制模板文件；Recurse 包含子目录；出现 Force 时会替换同名文件。
+</w:t>
+      </w:r>
+    </w:p>
+    <w:p>
+      <w:pPr>
+        <w:shd w:fill="F1F5F8" w:val="clear"/>
+        <w:spacing w:after="0" w:before="0" w:line="240"/>
+        <w:ind w:left="120"/>
+      </w:pPr>
+      <w:r>
+        <w:rPr>
+          <w:rFonts w:ascii="Consolas" w:eastAsia="Microsoft YaHei" w:hAnsi="Consolas"/>
+          <w:color w:val="123F51"/>
+          <w:sz w:val="18"/>
+          <w:szCs w:val="18"/>
+        </w:rPr>
         <w:t xml:space="preserve">  Copy-Item -LiteralPath './kit-01-v12/starter' -Destination $project -Recurse
 </w:t>
       </w:r>
@@ -629,6 +1147,50 @@
     </w:p>
     <w:p>
       <w:pPr>
+        <w:spacing w:after="90" w:before="90" w:line="290"/>
+      </w:pPr>
+      <w:r>
+        <w:t xml:space="preserve">运行平台：Windows 10/11 · PowerShell。输入位置：VS Code 下方的 PowerShell 终端。
+</w:t>
+      </w:r>
+    </w:p>
+    <w:p>
+      <w:pPr>
+        <w:spacing w:after="90" w:before="90" w:line="290"/>
+      </w:pPr>
+      <w:r>
+        <w:t xml:space="preserve">当前目录：当前目录可以任意；本代码框会切换到指定目录。
+</w:t>
+      </w:r>
+    </w:p>
+    <w:p>
+      <w:pPr>
+        <w:spacing w:after="90" w:before="90" w:line="290"/>
+      </w:pPr>
+      <w:r>
+        <w:t xml:space="preserve">运行方法：点击终端最后一行，粘贴本代码框并按 Enter；# 开头是注释，可以一起复制。看到预期结果后再做下一步。
+</w:t>
+      </w:r>
+    </w:p>
+    <w:p>
+      <w:pPr>
+        <w:shd w:fill="F1F5F8" w:val="clear"/>
+        <w:spacing w:after="0" w:before="0" w:line="240"/>
+        <w:ind w:left="120"/>
+      </w:pPr>
+      <w:r>
+        <w:rPr>
+          <w:rFonts w:ascii="Consolas" w:eastAsia="Microsoft YaHei" w:hAnsi="Consolas"/>
+          <w:color w:val="123F51"/>
+          <w:sz w:val="18"/>
+          <w:szCs w:val="18"/>
+        </w:rPr>
+        <w:t xml:space="preserve"># 进入指定文件夹，后面的命令将在这个目录里运行。
+</w:t>
+      </w:r>
+    </w:p>
+    <w:p>
+      <w:pPr>
         <w:shd w:fill="F1F5F8" w:val="clear"/>
         <w:spacing w:after="0" w:before="0" w:line="240"/>
         <w:ind w:left="120"/>
@@ -655,6 +1217,50 @@
     </w:p>
     <w:p>
       <w:pPr>
+        <w:spacing w:after="90" w:before="90" w:line="290"/>
+      </w:pPr>
+      <w:r>
+        <w:t xml:space="preserve">运行平台：Windows 10/11 · PowerShell。输入位置：VS Code 下方的 PowerShell 终端。
+</w:t>
+      </w:r>
+    </w:p>
+    <w:p>
+      <w:pPr>
+        <w:spacing w:after="90" w:before="90" w:line="290"/>
+      </w:pPr>
+      <w:r>
+        <w:t xml:space="preserve">当前目录：web-work/p1-portfolio（自己的开发工程）
+</w:t>
+      </w:r>
+    </w:p>
+    <w:p>
+      <w:pPr>
+        <w:spacing w:after="90" w:before="90" w:line="290"/>
+      </w:pPr>
+      <w:r>
+        <w:t xml:space="preserve">运行方法：点击终端最后一行，粘贴本代码框并按 Enter；# 开头是注释，可以一起复制。看到预期结果后再做下一步。
+</w:t>
+      </w:r>
+    </w:p>
+    <w:p>
+      <w:pPr>
+        <w:shd w:fill="F1F5F8" w:val="clear"/>
+        <w:spacing w:after="0" w:before="0" w:line="240"/>
+        <w:ind w:left="120"/>
+      </w:pPr>
+      <w:r>
+        <w:rPr>
+          <w:rFonts w:ascii="Consolas" w:eastAsia="Microsoft YaHei" w:hAnsi="Consolas"/>
+          <w:color w:val="123F51"/>
+          <w:sz w:val="18"/>
+          <w:szCs w:val="18"/>
+        </w:rPr>
+        <w:t xml:space="preserve"># 用 VS Code 打开当前文件夹；点号表示当前目录。
+</w:t>
+      </w:r>
+    </w:p>
+    <w:p>
+      <w:pPr>
         <w:shd w:fill="F1F5F8" w:val="clear"/>
         <w:spacing w:after="0" w:before="0" w:line="240"/>
         <w:ind w:left="120"/>
@@ -702,16 +1308,60 @@
         <w:spacing w:after="90" w:before="90" w:line="290"/>
       </w:pPr>
       <w:r>
-        <w:t xml:space="preserve">## 4. 运行初稿，准备两个终端
-</w:t>
-      </w:r>
-    </w:p>
-    <w:p>
-      <w:pPr>
-        <w:spacing w:after="90" w:before="90" w:line="290"/>
-      </w:pPr>
-      <w:r>
-        <w:t xml:space="preserve">在 VS Code 顶部点击“终端 → 新建终端”。看终端标签，选择 PowerShell；如果默认不是，在终端右上方下拉菜单选择 PowerShell 新建。把这个终端记作 A，用来运行网页。
+        <w:t xml:space="preserve">## 4. 运行初稿，先使用一个终端
+</w:t>
+      </w:r>
+    </w:p>
+    <w:p>
+      <w:pPr>
+        <w:spacing w:after="90" w:before="90" w:line="290"/>
+      </w:pPr>
+      <w:r>
+        <w:t xml:space="preserve">在 VS Code 顶部点击“终端 → 新建终端”。看终端标签，选择 PowerShell；如果默认不是，在终端右上方下拉菜单选择 PowerShell 新建。第一次只使用这个终端。需要输入检查或 Git 命令时，按 Ctrl+C 停止网页，等 PS 提示符重新出现，再输入下一条命令。
+</w:t>
+      </w:r>
+    </w:p>
+    <w:p>
+      <w:pPr>
+        <w:spacing w:after="90" w:before="90" w:line="290"/>
+      </w:pPr>
+      <w:r>
+        <w:t xml:space="preserve">运行平台：Windows 10/11 · PowerShell。输入位置：VS Code 下方的 PowerShell 终端。
+</w:t>
+      </w:r>
+    </w:p>
+    <w:p>
+      <w:pPr>
+        <w:spacing w:after="90" w:before="90" w:line="290"/>
+      </w:pPr>
+      <w:r>
+        <w:t xml:space="preserve">当前目录：当前目录可以任意；本代码框会切换到指定目录。
+</w:t>
+      </w:r>
+    </w:p>
+    <w:p>
+      <w:pPr>
+        <w:spacing w:after="90" w:before="90" w:line="290"/>
+      </w:pPr>
+      <w:r>
+        <w:t xml:space="preserve">运行方法：点击终端最后一行，粘贴本代码框并按 Enter；# 开头是注释，可以一起复制。看到预期结果后再做下一步。
+</w:t>
+      </w:r>
+    </w:p>
+    <w:p>
+      <w:pPr>
+        <w:shd w:fill="F1F5F8" w:val="clear"/>
+        <w:spacing w:after="0" w:before="0" w:line="240"/>
+        <w:ind w:left="120"/>
+      </w:pPr>
+      <w:r>
+        <w:rPr>
+          <w:rFonts w:ascii="Consolas" w:eastAsia="Microsoft YaHei" w:hAnsi="Consolas"/>
+          <w:color w:val="123F51"/>
+          <w:sz w:val="18"/>
+          <w:szCs w:val="18"/>
+        </w:rPr>
+        <w:t xml:space="preserve"># 进入指定文件夹，后面的命令将在这个目录里运行。
 </w:t>
       </w:r>
     </w:p>
@@ -743,6 +1393,50 @@
     </w:p>
     <w:p>
       <w:pPr>
+        <w:spacing w:after="90" w:before="90" w:line="290"/>
+      </w:pPr>
+      <w:r>
+        <w:t xml:space="preserve">运行平台：Windows 10/11 · PowerShell。输入位置：VS Code 下方的 PowerShell 终端。
+</w:t>
+      </w:r>
+    </w:p>
+    <w:p>
+      <w:pPr>
+        <w:spacing w:after="90" w:before="90" w:line="290"/>
+      </w:pPr>
+      <w:r>
+        <w:t xml:space="preserve">当前目录：web-work/p1-portfolio（自己的开发工程）
+</w:t>
+      </w:r>
+    </w:p>
+    <w:p>
+      <w:pPr>
+        <w:spacing w:after="90" w:before="90" w:line="290"/>
+      </w:pPr>
+      <w:r>
+        <w:t xml:space="preserve">运行方法：点击终端最后一行，粘贴本代码框并按 Enter；# 开头是注释，可以一起复制。看到预期结果后再做下一步。
+</w:t>
+      </w:r>
+    </w:p>
+    <w:p>
+      <w:pPr>
+        <w:shd w:fill="F1F5F8" w:val="clear"/>
+        <w:spacing w:after="0" w:before="0" w:line="240"/>
+        <w:ind w:left="120"/>
+      </w:pPr>
+      <w:r>
+        <w:rPr>
+          <w:rFonts w:ascii="Consolas" w:eastAsia="Microsoft YaHei" w:hAnsi="Consolas"/>
+          <w:color w:val="123F51"/>
+          <w:sz w:val="18"/>
+          <w:szCs w:val="18"/>
+        </w:rPr>
+        <w:t xml:space="preserve"># 检查路径是否存在，存在输出 True，不存在输出 False。
+</w:t>
+      </w:r>
+    </w:p>
+    <w:p>
+      <w:pPr>
         <w:shd w:fill="F1F5F8" w:val="clear"/>
         <w:spacing w:after="0" w:before="0" w:line="240"/>
         <w:ind w:left="120"/>
@@ -778,6 +1472,50 @@
     </w:p>
     <w:p>
       <w:pPr>
+        <w:spacing w:after="90" w:before="90" w:line="290"/>
+      </w:pPr>
+      <w:r>
+        <w:t xml:space="preserve">运行平台：Windows 10/11 · PowerShell。输入位置：VS Code 下方的 PowerShell 终端。
+</w:t>
+      </w:r>
+    </w:p>
+    <w:p>
+      <w:pPr>
+        <w:spacing w:after="90" w:before="90" w:line="290"/>
+      </w:pPr>
+      <w:r>
+        <w:t xml:space="preserve">当前目录：web-work/p1-portfolio（自己的开发工程）
+</w:t>
+      </w:r>
+    </w:p>
+    <w:p>
+      <w:pPr>
+        <w:spacing w:after="90" w:before="90" w:line="290"/>
+      </w:pPr>
+      <w:r>
+        <w:t xml:space="preserve">运行方法：点击终端最后一行，粘贴本代码框并按 Enter；# 开头是注释，可以一起复制。看到预期结果后再做下一步。
+</w:t>
+      </w:r>
+    </w:p>
+    <w:p>
+      <w:pPr>
+        <w:shd w:fill="F1F5F8" w:val="clear"/>
+        <w:spacing w:after="0" w:before="0" w:line="240"/>
+        <w:ind w:left="120"/>
+      </w:pPr>
+      <w:r>
+        <w:rPr>
+          <w:rFonts w:ascii="Consolas" w:eastAsia="Microsoft YaHei" w:hAnsi="Consolas"/>
+          <w:color w:val="123F51"/>
+          <w:sz w:val="18"/>
+          <w:szCs w:val="18"/>
+        </w:rPr>
+        <w:t xml:space="preserve"># 按照 package-lock.json 安装依赖，等待结束后再输入下一条命令。
+</w:t>
+      </w:r>
+    </w:p>
+    <w:p>
+      <w:pPr>
         <w:shd w:fill="F1F5F8" w:val="clear"/>
         <w:spacing w:after="0" w:before="0" w:line="240"/>
         <w:ind w:left="120"/>
@@ -813,6 +1551,50 @@
     </w:p>
     <w:p>
       <w:pPr>
+        <w:spacing w:after="90" w:before="90" w:line="290"/>
+      </w:pPr>
+      <w:r>
+        <w:t xml:space="preserve">运行平台：Windows 10/11 · PowerShell。输入位置：VS Code 下方的 PowerShell 终端。
+</w:t>
+      </w:r>
+    </w:p>
+    <w:p>
+      <w:pPr>
+        <w:spacing w:after="90" w:before="90" w:line="290"/>
+      </w:pPr>
+      <w:r>
+        <w:t xml:space="preserve">当前目录：web-work/p1-portfolio（自己的开发工程）
+</w:t>
+      </w:r>
+    </w:p>
+    <w:p>
+      <w:pPr>
+        <w:spacing w:after="90" w:before="90" w:line="290"/>
+      </w:pPr>
+      <w:r>
+        <w:t xml:space="preserve">运行方法：点击终端最后一行，粘贴本代码框并按 Enter；# 开头是注释，可以一起复制。看到预期结果后再做下一步。
+</w:t>
+      </w:r>
+    </w:p>
+    <w:p>
+      <w:pPr>
+        <w:shd w:fill="F1F5F8" w:val="clear"/>
+        <w:spacing w:after="0" w:before="0" w:line="240"/>
+        <w:ind w:left="120"/>
+      </w:pPr>
+      <w:r>
+        <w:rPr>
+          <w:rFonts w:ascii="Consolas" w:eastAsia="Microsoft YaHei" w:hAnsi="Consolas"/>
+          <w:color w:val="123F51"/>
+          <w:sz w:val="18"/>
+          <w:szCs w:val="18"/>
+        </w:rPr>
+        <w:t xml:space="preserve"># 检查初稿是否齐全；允许课堂 TODO 尚未完成。
+</w:t>
+      </w:r>
+    </w:p>
+    <w:p>
+      <w:pPr>
         <w:shd w:fill="F1F5F8" w:val="clear"/>
         <w:spacing w:after="0" w:before="0" w:line="240"/>
         <w:ind w:left="120"/>
@@ -848,6 +1630,50 @@
     </w:p>
     <w:p>
       <w:pPr>
+        <w:spacing w:after="90" w:before="90" w:line="290"/>
+      </w:pPr>
+      <w:r>
+        <w:t xml:space="preserve">运行平台：Windows 10/11 · PowerShell。输入位置：VS Code 下方的 PowerShell 终端。
+</w:t>
+      </w:r>
+    </w:p>
+    <w:p>
+      <w:pPr>
+        <w:spacing w:after="90" w:before="90" w:line="290"/>
+      </w:pPr>
+      <w:r>
+        <w:t xml:space="preserve">当前目录：web-work/p1-portfolio（自己的开发工程）
+</w:t>
+      </w:r>
+    </w:p>
+    <w:p>
+      <w:pPr>
+        <w:spacing w:after="90" w:before="90" w:line="290"/>
+      </w:pPr>
+      <w:r>
+        <w:t xml:space="preserve">运行方法：点击终端最后一行，粘贴本代码框并按 Enter；# 开头是注释，可以一起复制。看到预期结果后再做下一步。
+</w:t>
+      </w:r>
+    </w:p>
+    <w:p>
+      <w:pPr>
+        <w:shd w:fill="F1F5F8" w:val="clear"/>
+        <w:spacing w:after="0" w:before="0" w:line="240"/>
+        <w:ind w:left="120"/>
+      </w:pPr>
+      <w:r>
+        <w:rPr>
+          <w:rFonts w:ascii="Consolas" w:eastAsia="Microsoft YaHei" w:hAnsi="Consolas"/>
+          <w:color w:val="123F51"/>
+          <w:sz w:val="18"/>
+          <w:szCs w:val="18"/>
+        </w:rPr>
+        <w:t xml:space="preserve"># 启动本地网页；持续运行时没有新的 PS 提示符是正常现象。
+</w:t>
+      </w:r>
+    </w:p>
+    <w:p>
+      <w:pPr>
         <w:shd w:fill="F1F5F8" w:val="clear"/>
         <w:spacing w:after="0" w:before="0" w:line="240"/>
         <w:ind w:left="120"/>
@@ -895,7 +1721,756 @@
         <w:spacing w:after="90" w:before="90" w:line="290"/>
       </w:pPr>
       <w:r>
-        <w:t xml:space="preserve">保持 A 运行。点击终端区域右上方的“+”新建另一个 PowerShell 终端，记作 B，用于检查和 Git。在 B 中再次执行下面命令：
+        <w:t xml:space="preserve">保持当前网页服务运行，先进入第 5 步修改代码。直到第 6 步开始检查时，才按 Ctrl+C 停止网页。
+</w:t>
+      </w:r>
+    </w:p>
+    <w:p>
+      <w:pPr>
+        <w:spacing w:after="90" w:before="90" w:line="290"/>
+      </w:pPr>
+      <w:r>
+        <w:t xml:space="preserve">后续代码修改都在左侧编辑器完成。每改一处按 Ctrl+S 保存，再回浏览器按 Ctrl+R 刷新；第 1—5 课的服务不会替你自动刷新。关闭运行终端 或按 Ctrl+C 后网页服务会停止，再次使用要重跑 npm.cmd run dev。
+</w:t>
+      </w:r>
+    </w:p>
+    <w:p>
+      <w:pPr>
+        <w:spacing w:after="90" w:before="90" w:line="290"/>
+      </w:pPr>
+      <w:r>
+        <w:t xml:space="preserve">## 5. 具体开发：找到原文，再替换代码
+</w:t>
+      </w:r>
+    </w:p>
+    <w:p>
+      <w:pPr>
+        <w:spacing w:after="90" w:before="90" w:line="290"/>
+      </w:pPr>
+      <w:r>
+        <w:t xml:space="preserve">通用手势：点击 VS Code 左侧“资源管理器”图标，展开目录，单击指定文件。按 Ctrl+F 搜索给出的标记，按 Esc 关闭搜索框；鼠标选中需要替换的原文，把代码粘贴到编辑区，按 Ctrl+S。不要把代码粘贴进搜索框或终端。
+</w:t>
+      </w:r>
+    </w:p>
+    <w:p>
+      <w:pPr>
+        <w:spacing w:after="90" w:before="90" w:line="290"/>
+      </w:pPr>
+      <w:r>
+        <w:t xml:space="preserve">代码示范用于带做。先说明自己预期网页发生什么变化，再输入、保存并观察；完成后至少做一处个人修改，解释修改理由。
+</w:t>
+      </w:r>
+    </w:p>
+    <w:p>
+      <w:pPr>
+        <w:spacing w:after="90" w:before="90" w:line="290"/>
+      </w:pPr>
+      <w:r>
+        <w:t xml:space="preserve">### 5.1 先改网页主标题，确认自己编辑的是正确文件
+</w:t>
+      </w:r>
+    </w:p>
+    <w:p>
+      <w:pPr>
+        <w:spacing w:after="90" w:before="90" w:line="290"/>
+      </w:pPr>
+      <w:r>
+        <w:t xml:space="preserve">打开 index.html，Ctrl+F 搜索“你好，我是林晓”。只改标签之间的文字，例如把整行改成下面这样。周小禾是示例名，你可以使用自己的公开展示名。
+</w:t>
+      </w:r>
+    </w:p>
+    <w:p>
+      <w:pPr>
+        <w:shd w:fill="F1F5F8" w:val="clear"/>
+        <w:spacing w:after="0" w:before="0" w:line="240"/>
+        <w:ind w:left="120"/>
+      </w:pPr>
+      <w:r>
+        <w:rPr>
+          <w:rFonts w:ascii="Consolas" w:eastAsia="Microsoft YaHei" w:hAnsi="Consolas"/>
+          <w:color w:val="123F51"/>
+          <w:sz w:val="18"/>
+          <w:szCs w:val="18"/>
+        </w:rPr>
+        <w:t xml:space="preserve">    &lt;h1&gt;你好，我是周小禾&lt;/h1&gt;
+</w:t>
+      </w:r>
+    </w:p>
+    <w:p>
+      <w:pPr>
+        <w:spacing w:after="90" w:before="90" w:line="290"/>
+      </w:pPr>
+      <w:r>
+        <w:t xml:space="preserve">保存并刷新，页面大标题应立即改变。若没变：先看编辑器是否打开 p1-portfolio，文件标签是否还有未保存圆点，再看浏览器是不是 终端显示的 Local 地址。
+</w:t>
+      </w:r>
+    </w:p>
+    <w:p>
+      <w:pPr>
+        <w:spacing w:after="90" w:before="90" w:line="290"/>
+      </w:pPr>
+      <w:r>
+        <w:t xml:space="preserve">随后 Ctrl+F 搜索其余“林晓”，逐处修改 title、description 和 footer 中的展示名。只改文字，保留标签与属性引号。联系信息可以继续使用模板中的虚构演示邮箱。
+</w:t>
+      </w:r>
+    </w:p>
+    <w:p>
+      <w:pPr>
+        <w:spacing w:after="90" w:before="90" w:line="290"/>
+      </w:pPr>
+      <w:r>
+        <w:t xml:space="preserve">### 5.2 修改 index.html
+</w:t>
+      </w:r>
+    </w:p>
+    <w:p>
+      <w:pPr>
+        <w:spacing w:after="90" w:before="90" w:line="290"/>
+      </w:pPr>
+      <w:r>
+        <w:t xml:space="preserve">打开 p1-portfolio/index.html。搜索 TODO-L1，找到下面这段原文。只选中这段，不要选中相邻函数或其他区块。
+</w:t>
+      </w:r>
+    </w:p>
+    <w:p>
+      <w:pPr>
+        <w:spacing w:after="90" w:before="90" w:line="290"/>
+      </w:pPr>
+      <w:r>
+        <w:t xml:space="preserve">修改前：
+</w:t>
+      </w:r>
+    </w:p>
+    <w:p>
+      <w:pPr>
+        <w:shd w:fill="F1F5F8" w:val="clear"/>
+        <w:spacing w:after="0" w:before="0" w:line="240"/>
+        <w:ind w:left="120"/>
+      </w:pPr>
+      <w:r>
+        <w:rPr>
+          <w:rFonts w:ascii="Consolas" w:eastAsia="Microsoft YaHei" w:hAnsi="Consolas"/>
+          <w:color w:val="123F51"/>
+          <w:sz w:val="18"/>
+          <w:szCs w:val="18"/>
+        </w:rPr>
+        <w:t xml:space="preserve">&lt;!-- TODO-L1: 在这里编写 about-title 对应的完整 section --&gt;
+</w:t>
+      </w:r>
+    </w:p>
+    <w:p>
+      <w:pPr>
+        <w:spacing w:after="90" w:before="90" w:line="290"/>
+      </w:pPr>
+      <w:r>
+        <w:t xml:space="preserve">替换成：
+</w:t>
+      </w:r>
+    </w:p>
+    <w:p>
+      <w:pPr>
+        <w:shd w:fill="F1F5F8" w:val="clear"/>
+        <w:spacing w:after="0" w:before="0" w:line="240"/>
+        <w:ind w:left="120"/>
+      </w:pPr>
+      <w:r>
+        <w:rPr>
+          <w:rFonts w:ascii="Consolas" w:eastAsia="Microsoft YaHei" w:hAnsi="Consolas"/>
+          <w:color w:val="123F51"/>
+          <w:sz w:val="18"/>
+          <w:szCs w:val="18"/>
+        </w:rPr>
+        <w:t xml:space="preserve">&lt;section aria-labelledby="about-title"&gt;
+</w:t>
+      </w:r>
+    </w:p>
+    <w:p>
+      <w:pPr>
+        <w:shd w:fill="F1F5F8" w:val="clear"/>
+        <w:spacing w:after="0" w:before="0" w:line="240"/>
+        <w:ind w:left="120"/>
+      </w:pPr>
+      <w:r>
+        <w:rPr>
+          <w:rFonts w:ascii="Consolas" w:eastAsia="Microsoft YaHei" w:hAnsi="Consolas"/>
+          <w:color w:val="123F51"/>
+          <w:sz w:val="18"/>
+          <w:szCs w:val="18"/>
+        </w:rPr>
+        <w:t xml:space="preserve">      &lt;h2 id="about-title"&gt;关于我&lt;/h2&gt;
+</w:t>
+      </w:r>
+    </w:p>
+    <w:p>
+      <w:pPr>
+        <w:shd w:fill="F1F5F8" w:val="clear"/>
+        <w:spacing w:after="0" w:before="0" w:line="240"/>
+        <w:ind w:left="120"/>
+      </w:pPr>
+      <w:r>
+        <w:rPr>
+          <w:rFonts w:ascii="Consolas" w:eastAsia="Microsoft YaHei" w:hAnsi="Consolas"/>
+          <w:color w:val="123F51"/>
+          <w:sz w:val="18"/>
+          <w:szCs w:val="18"/>
+        </w:rPr>
+        <w:t xml:space="preserve">      &lt;p&gt;我正在学习 HTML、CSS、JavaScript 与软件发布，希望成长为重视用户体验的前端开发者。&lt;/p&gt;
+</w:t>
+      </w:r>
+    </w:p>
+    <w:p>
+      <w:pPr>
+        <w:shd w:fill="F1F5F8" w:val="clear"/>
+        <w:spacing w:after="0" w:before="0" w:line="240"/>
+        <w:ind w:left="120"/>
+      </w:pPr>
+      <w:r>
+        <w:rPr>
+          <w:rFonts w:ascii="Consolas" w:eastAsia="Microsoft YaHei" w:hAnsi="Consolas"/>
+          <w:color w:val="123F51"/>
+          <w:sz w:val="18"/>
+          <w:szCs w:val="18"/>
+        </w:rPr>
+        <w:t xml:space="preserve">    &lt;/section&gt;
+</w:t>
+      </w:r>
+    </w:p>
+    <w:p>
+      <w:pPr>
+        <w:spacing w:after="90" w:before="90" w:line="290"/>
+      </w:pPr>
+      <w:r>
+        <w:t xml:space="preserve">代码解释：section 是一个主题区块，h2 是区块标题。aria-labelledby 的值要与 h2 的 id 完全相同。p 中写自己的介绍。
+</w:t>
+      </w:r>
+    </w:p>
+    <w:p>
+      <w:pPr>
+        <w:spacing w:after="90" w:before="90" w:line="290"/>
+      </w:pPr>
+      <w:r>
+        <w:t xml:space="preserve">按 Ctrl+S 保存，回浏览器 Ctrl+R 刷新，再做下方检查。
+</w:t>
+      </w:r>
+    </w:p>
+    <w:p>
+      <w:pPr>
+        <w:spacing w:after="90" w:before="90" w:line="290"/>
+      </w:pPr>
+      <w:r>
+        <w:t xml:space="preserve">### 5.3 修改 index.html
+</w:t>
+      </w:r>
+    </w:p>
+    <w:p>
+      <w:pPr>
+        <w:spacing w:after="90" w:before="90" w:line="290"/>
+      </w:pPr>
+      <w:r>
+        <w:t xml:space="preserve">打开 p1-portfolio/index.html。搜索 TODO-L1，找到下面这段原文。只选中这段，不要选中相邻函数或其他区块。
+</w:t>
+      </w:r>
+    </w:p>
+    <w:p>
+      <w:pPr>
+        <w:spacing w:after="90" w:before="90" w:line="290"/>
+      </w:pPr>
+      <w:r>
+        <w:t xml:space="preserve">修改前：
+</w:t>
+      </w:r>
+    </w:p>
+    <w:p>
+      <w:pPr>
+        <w:shd w:fill="F1F5F8" w:val="clear"/>
+        <w:spacing w:after="0" w:before="0" w:line="240"/>
+        <w:ind w:left="120"/>
+      </w:pPr>
+      <w:r>
+        <w:rPr>
+          <w:rFonts w:ascii="Consolas" w:eastAsia="Microsoft YaHei" w:hAnsi="Consolas"/>
+          <w:color w:val="123F51"/>
+          <w:sz w:val="18"/>
+          <w:szCs w:val="18"/>
+        </w:rPr>
+        <w:t xml:space="preserve">&lt;!-- TODO-L1: 在这里编写 skills-title 对应的完整 section --&gt;
+</w:t>
+      </w:r>
+    </w:p>
+    <w:p>
+      <w:pPr>
+        <w:spacing w:after="90" w:before="90" w:line="290"/>
+      </w:pPr>
+      <w:r>
+        <w:t xml:space="preserve">替换成：
+</w:t>
+      </w:r>
+    </w:p>
+    <w:p>
+      <w:pPr>
+        <w:shd w:fill="F1F5F8" w:val="clear"/>
+        <w:spacing w:after="0" w:before="0" w:line="240"/>
+        <w:ind w:left="120"/>
+      </w:pPr>
+      <w:r>
+        <w:rPr>
+          <w:rFonts w:ascii="Consolas" w:eastAsia="Microsoft YaHei" w:hAnsi="Consolas"/>
+          <w:color w:val="123F51"/>
+          <w:sz w:val="18"/>
+          <w:szCs w:val="18"/>
+        </w:rPr>
+        <w:t xml:space="preserve">&lt;section aria-labelledby="skills-title"&gt;
+</w:t>
+      </w:r>
+    </w:p>
+    <w:p>
+      <w:pPr>
+        <w:shd w:fill="F1F5F8" w:val="clear"/>
+        <w:spacing w:after="0" w:before="0" w:line="240"/>
+        <w:ind w:left="120"/>
+      </w:pPr>
+      <w:r>
+        <w:rPr>
+          <w:rFonts w:ascii="Consolas" w:eastAsia="Microsoft YaHei" w:hAnsi="Consolas"/>
+          <w:color w:val="123F51"/>
+          <w:sz w:val="18"/>
+          <w:szCs w:val="18"/>
+        </w:rPr>
+        <w:t xml:space="preserve">      &lt;h2 id="skills-title"&gt;正在掌握&lt;/h2&gt;
+</w:t>
+      </w:r>
+    </w:p>
+    <w:p>
+      <w:pPr>
+        <w:shd w:fill="F1F5F8" w:val="clear"/>
+        <w:spacing w:after="0" w:before="0" w:line="240"/>
+        <w:ind w:left="120"/>
+      </w:pPr>
+      <w:r>
+        <w:rPr>
+          <w:rFonts w:ascii="Consolas" w:eastAsia="Microsoft YaHei" w:hAnsi="Consolas"/>
+          <w:color w:val="123F51"/>
+          <w:sz w:val="18"/>
+          <w:szCs w:val="18"/>
+        </w:rPr>
+        <w:t xml:space="preserve">      &lt;ul class="tag-list"&gt;
+</w:t>
+      </w:r>
+    </w:p>
+    <w:p>
+      <w:pPr>
+        <w:shd w:fill="F1F5F8" w:val="clear"/>
+        <w:spacing w:after="0" w:before="0" w:line="240"/>
+        <w:ind w:left="120"/>
+      </w:pPr>
+      <w:r>
+        <w:rPr>
+          <w:rFonts w:ascii="Consolas" w:eastAsia="Microsoft YaHei" w:hAnsi="Consolas"/>
+          <w:color w:val="123F51"/>
+          <w:sz w:val="18"/>
+          <w:szCs w:val="18"/>
+        </w:rPr>
+        <w:t xml:space="preserve">        &lt;li&gt;语义化 HTML&lt;/li&gt;
+</w:t>
+      </w:r>
+    </w:p>
+    <w:p>
+      <w:pPr>
+        <w:shd w:fill="F1F5F8" w:val="clear"/>
+        <w:spacing w:after="0" w:before="0" w:line="240"/>
+        <w:ind w:left="120"/>
+      </w:pPr>
+      <w:r>
+        <w:rPr>
+          <w:rFonts w:ascii="Consolas" w:eastAsia="Microsoft YaHei" w:hAnsi="Consolas"/>
+          <w:color w:val="123F51"/>
+          <w:sz w:val="18"/>
+          <w:szCs w:val="18"/>
+        </w:rPr>
+        <w:t xml:space="preserve">        &lt;li&gt;响应式 CSS&lt;/li&gt;
+</w:t>
+      </w:r>
+    </w:p>
+    <w:p>
+      <w:pPr>
+        <w:shd w:fill="F1F5F8" w:val="clear"/>
+        <w:spacing w:after="0" w:before="0" w:line="240"/>
+        <w:ind w:left="120"/>
+      </w:pPr>
+      <w:r>
+        <w:rPr>
+          <w:rFonts w:ascii="Consolas" w:eastAsia="Microsoft YaHei" w:hAnsi="Consolas"/>
+          <w:color w:val="123F51"/>
+          <w:sz w:val="18"/>
+          <w:szCs w:val="18"/>
+        </w:rPr>
+        <w:t xml:space="preserve">        &lt;li&gt;Git 与 GitHub&lt;/li&gt;
+</w:t>
+      </w:r>
+    </w:p>
+    <w:p>
+      <w:pPr>
+        <w:shd w:fill="F1F5F8" w:val="clear"/>
+        <w:spacing w:after="0" w:before="0" w:line="240"/>
+        <w:ind w:left="120"/>
+      </w:pPr>
+      <w:r>
+        <w:rPr>
+          <w:rFonts w:ascii="Consolas" w:eastAsia="Microsoft YaHei" w:hAnsi="Consolas"/>
+          <w:color w:val="123F51"/>
+          <w:sz w:val="18"/>
+          <w:szCs w:val="18"/>
+        </w:rPr>
+        <w:t xml:space="preserve">      &lt;/ul&gt;
+</w:t>
+      </w:r>
+    </w:p>
+    <w:p>
+      <w:pPr>
+        <w:shd w:fill="F1F5F8" w:val="clear"/>
+        <w:spacing w:after="0" w:before="0" w:line="240"/>
+        <w:ind w:left="120"/>
+      </w:pPr>
+      <w:r>
+        <w:rPr>
+          <w:rFonts w:ascii="Consolas" w:eastAsia="Microsoft YaHei" w:hAnsi="Consolas"/>
+          <w:color w:val="123F51"/>
+          <w:sz w:val="18"/>
+          <w:szCs w:val="18"/>
+        </w:rPr>
+        <w:t xml:space="preserve">    &lt;/section&gt;
+</w:t>
+      </w:r>
+    </w:p>
+    <w:p>
+      <w:pPr>
+        <w:spacing w:after="90" w:before="90" w:line="290"/>
+      </w:pPr>
+      <w:r>
+        <w:t xml:space="preserve">代码解释：section 是一个主题区块，h2 是区块标题。aria-labelledby 的值要与 h2 的 id 完全相同。ul 是列表，每个 li 是一项技能，至少保留两项。
+</w:t>
+      </w:r>
+    </w:p>
+    <w:p>
+      <w:pPr>
+        <w:spacing w:after="90" w:before="90" w:line="290"/>
+      </w:pPr>
+      <w:r>
+        <w:t xml:space="preserve">按 Ctrl+S 保存，回浏览器 Ctrl+R 刷新，再做下方检查。
+</w:t>
+      </w:r>
+    </w:p>
+    <w:p>
+      <w:pPr>
+        <w:spacing w:after="90" w:before="90" w:line="290"/>
+      </w:pPr>
+      <w:r>
+        <w:t xml:space="preserve">### 5.4 修改 styles.css
+</w:t>
+      </w:r>
+    </w:p>
+    <w:p>
+      <w:pPr>
+        <w:spacing w:after="90" w:before="90" w:line="290"/>
+      </w:pPr>
+      <w:r>
+        <w:t xml:space="preserve">打开 p1-portfolio/styles.css。搜索 section {，在这个样式区块内找到 padding: 24px;。只改这一行，不改其他选择器中的 padding。
+</w:t>
+      </w:r>
+    </w:p>
+    <w:p>
+      <w:pPr>
+        <w:spacing w:after="90" w:before="90" w:line="290"/>
+      </w:pPr>
+      <w:r>
+        <w:t xml:space="preserve">修改前：
+</w:t>
+      </w:r>
+    </w:p>
+    <w:p>
+      <w:pPr>
+        <w:shd w:fill="F1F5F8" w:val="clear"/>
+        <w:spacing w:after="0" w:before="0" w:line="240"/>
+        <w:ind w:left="120"/>
+      </w:pPr>
+      <w:r>
+        <w:rPr>
+          <w:rFonts w:ascii="Consolas" w:eastAsia="Microsoft YaHei" w:hAnsi="Consolas"/>
+          <w:color w:val="123F51"/>
+          <w:sz w:val="18"/>
+          <w:szCs w:val="18"/>
+        </w:rPr>
+        <w:t xml:space="preserve">padding: 24px;
+</w:t>
+      </w:r>
+    </w:p>
+    <w:p>
+      <w:pPr>
+        <w:spacing w:after="90" w:before="90" w:line="290"/>
+      </w:pPr>
+      <w:r>
+        <w:t xml:space="preserve">替换成：
+</w:t>
+      </w:r>
+    </w:p>
+    <w:p>
+      <w:pPr>
+        <w:shd w:fill="F1F5F8" w:val="clear"/>
+        <w:spacing w:after="0" w:before="0" w:line="240"/>
+        <w:ind w:left="120"/>
+      </w:pPr>
+      <w:r>
+        <w:rPr>
+          <w:rFonts w:ascii="Consolas" w:eastAsia="Microsoft YaHei" w:hAnsi="Consolas"/>
+          <w:color w:val="123F51"/>
+          <w:sz w:val="18"/>
+          <w:szCs w:val="18"/>
+        </w:rPr>
+        <w:t xml:space="preserve">padding: 28px;
+</w:t>
+      </w:r>
+    </w:p>
+    <w:p>
+      <w:pPr>
+        <w:spacing w:after="90" w:before="90" w:line="290"/>
+      </w:pPr>
+      <w:r>
+        <w:t xml:space="preserve">代码解释：只替换 section { ... } 中这一行。padding 控制卡片内容与边框的距离，单位 px 是像素。
+</w:t>
+      </w:r>
+    </w:p>
+    <w:p>
+      <w:pPr>
+        <w:spacing w:after="90" w:before="90" w:line="290"/>
+      </w:pPr>
+      <w:r>
+        <w:t xml:space="preserve">按 Ctrl+S 保存，回浏览器 Ctrl+R 刷新，再做下方检查。
+</w:t>
+      </w:r>
+    </w:p>
+    <w:p>
+      <w:pPr>
+        <w:spacing w:after="90" w:before="90" w:line="290"/>
+      </w:pPr>
+      <w:r>
+        <w:t xml:space="preserve">### 5.6 逐项观察结果
+</w:t>
+      </w:r>
+    </w:p>
+    <w:p>
+      <w:pPr>
+        <w:spacing w:after="90" w:before="90" w:line="290"/>
+      </w:pPr>
+      <w:r>
+        <w:t xml:space="preserve">页面出现“关于我”和“正在掌握”两个区块，至少两项技能。卡片内容距离边框比原来稍远。用 Tab 键移动到链接，应能看到黄色焦点框。第一段完成后回 PPT 第 23 页；间距与键盘检查完成后回第 27 页。
+</w:t>
+      </w:r>
+    </w:p>
+    <w:p>
+      <w:pPr>
+        <w:spacing w:after="90" w:before="90" w:line="290"/>
+      </w:pPr>
+      <w:r>
+        <w:t xml:space="preserve">### 5.7 写下本次改动
+</w:t>
+      </w:r>
+    </w:p>
+    <w:p>
+      <w:pPr>
+        <w:spacing w:after="90" w:before="90" w:line="290"/>
+      </w:pPr>
+      <w:r>
+        <w:t xml:space="preserve">在左侧打开 README.md，按 Ctrl+End 到文件末尾，新起一行追加下面这段。把示例中的说明改成你的实际操作，不要覆盖原有安装和运行说明。
+</w:t>
+      </w:r>
+    </w:p>
+    <w:p>
+      <w:pPr>
+        <w:shd w:fill="F1F5F8" w:val="clear"/>
+        <w:spacing w:after="0" w:before="0" w:line="240"/>
+        <w:ind w:left="120"/>
+      </w:pPr>
+      <w:r>
+        <w:rPr>
+          <w:rFonts w:ascii="Consolas" w:eastAsia="Microsoft YaHei" w:hAnsi="Consolas"/>
+          <w:color w:val="123F51"/>
+          <w:sz w:val="18"/>
+          <w:szCs w:val="18"/>
+        </w:rPr>
+        <w:t xml:space="preserve">## 我的本课记录
+</w:t>
+      </w:r>
+    </w:p>
+    <w:p>
+      <w:pPr>
+        <w:shd w:fill="F1F5F8" w:val="clear"/>
+        <w:spacing w:after="0" w:before="0" w:line="240"/>
+        <w:ind w:left="120"/>
+      </w:pPr>
+      <w:r>
+        <w:rPr>
+          <w:rFonts w:ascii="Consolas" w:eastAsia="Microsoft YaHei" w:hAnsi="Consolas"/>
+          <w:color w:val="123F51"/>
+          <w:sz w:val="18"/>
+          <w:szCs w:val="18"/>
+        </w:rPr>
+        <w:t xml:space="preserve">
+</w:t>
+      </w:r>
+    </w:p>
+    <w:p>
+      <w:pPr>
+        <w:shd w:fill="F1F5F8" w:val="clear"/>
+        <w:spacing w:after="0" w:before="0" w:line="240"/>
+        <w:ind w:left="120"/>
+      </w:pPr>
+      <w:r>
+        <w:rPr>
+          <w:rFonts w:ascii="Consolas" w:eastAsia="Microsoft YaHei" w:hAnsi="Consolas"/>
+          <w:color w:val="123F51"/>
+          <w:sz w:val="18"/>
+          <w:szCs w:val="18"/>
+        </w:rPr>
+        <w:t xml:space="preserve">展示名：周小禾
+</w:t>
+      </w:r>
+    </w:p>
+    <w:p>
+      <w:pPr>
+        <w:shd w:fill="F1F5F8" w:val="clear"/>
+        <w:spacing w:after="0" w:before="0" w:line="240"/>
+        <w:ind w:left="120"/>
+      </w:pPr>
+      <w:r>
+        <w:rPr>
+          <w:rFonts w:ascii="Consolas" w:eastAsia="Microsoft YaHei" w:hAnsi="Consolas"/>
+          <w:color w:val="123F51"/>
+          <w:sz w:val="18"/>
+          <w:szCs w:val="18"/>
+        </w:rPr>
+        <w:t xml:space="preserve">我修改的文件：填写实际文件名
+</w:t>
+      </w:r>
+    </w:p>
+    <w:p>
+      <w:pPr>
+        <w:shd w:fill="F1F5F8" w:val="clear"/>
+        <w:spacing w:after="0" w:before="0" w:line="240"/>
+        <w:ind w:left="120"/>
+      </w:pPr>
+      <w:r>
+        <w:rPr>
+          <w:rFonts w:ascii="Consolas" w:eastAsia="Microsoft YaHei" w:hAnsi="Consolas"/>
+          <w:color w:val="123F51"/>
+          <w:sz w:val="18"/>
+          <w:szCs w:val="18"/>
+        </w:rPr>
+        <w:t xml:space="preserve">修改目的：填写希望用户看到的变化
+</w:t>
+      </w:r>
+    </w:p>
+    <w:p>
+      <w:pPr>
+        <w:shd w:fill="F1F5F8" w:val="clear"/>
+        <w:spacing w:after="0" w:before="0" w:line="240"/>
+        <w:ind w:left="120"/>
+      </w:pPr>
+      <w:r>
+        <w:rPr>
+          <w:rFonts w:ascii="Consolas" w:eastAsia="Microsoft YaHei" w:hAnsi="Consolas"/>
+          <w:color w:val="123F51"/>
+          <w:sz w:val="18"/>
+          <w:szCs w:val="18"/>
+        </w:rPr>
+        <w:t xml:space="preserve">验证方法：填写自己实际执行的检查
+</w:t>
+      </w:r>
+    </w:p>
+    <w:p>
+      <w:pPr>
+        <w:shd w:fill="F1F5F8" w:val="clear"/>
+        <w:spacing w:after="0" w:before="0" w:line="240"/>
+        <w:ind w:left="120"/>
+      </w:pPr>
+      <w:r>
+        <w:rPr>
+          <w:rFonts w:ascii="Consolas" w:eastAsia="Microsoft YaHei" w:hAnsi="Consolas"/>
+          <w:color w:val="123F51"/>
+          <w:sz w:val="18"/>
+          <w:szCs w:val="18"/>
+        </w:rPr>
+        <w:t xml:space="preserve">结果：填写页面变化或错误修复情况
+</w:t>
+      </w:r>
+    </w:p>
+    <w:p>
+      <w:pPr>
+        <w:spacing w:after="90" w:before="90" w:line="290"/>
+      </w:pPr>
+      <w:r>
+        <w:t xml:space="preserve">这一步让下一位同学或未来的自己能理解本次修改。填完 Ctrl+S 保存。
+</w:t>
+      </w:r>
+    </w:p>
+    <w:p>
+      <w:pPr>
+        <w:spacing w:after="90" w:before="90" w:line="290"/>
+      </w:pPr>
+      <w:r>
+        <w:t xml:space="preserve">## 6. 检查后再提交
+</w:t>
+      </w:r>
+    </w:p>
+    <w:p>
+      <w:pPr>
+        <w:spacing w:after="90" w:before="90" w:line="290"/>
+      </w:pPr>
+      <w:r>
+        <w:t xml:space="preserve">位置：VS Code 下方 PowerShell 终端。先按 Ctrl+C 停止网页，等 PS 提示符出现，再执行检查。
+</w:t>
+      </w:r>
+    </w:p>
+    <w:p>
+      <w:pPr>
+        <w:spacing w:after="90" w:before="90" w:line="290"/>
+      </w:pPr>
+      <w:r>
+        <w:t xml:space="preserve">运行平台：Windows 10/11 · PowerShell。输入位置：VS Code 下方的 PowerShell 终端。
+</w:t>
+      </w:r>
+    </w:p>
+    <w:p>
+      <w:pPr>
+        <w:spacing w:after="90" w:before="90" w:line="290"/>
+      </w:pPr>
+      <w:r>
+        <w:t xml:space="preserve">当前目录：当前目录可以任意；本代码框会切换到指定目录。
+</w:t>
+      </w:r>
+    </w:p>
+    <w:p>
+      <w:pPr>
+        <w:spacing w:after="90" w:before="90" w:line="290"/>
+      </w:pPr>
+      <w:r>
+        <w:t xml:space="preserve">运行方法：点击终端最后一行，粘贴本代码框并按 Enter；# 开头是注释，可以一起复制。看到预期结果后再做下一步。
+</w:t>
+      </w:r>
+    </w:p>
+    <w:p>
+      <w:pPr>
+        <w:shd w:fill="F1F5F8" w:val="clear"/>
+        <w:spacing w:after="0" w:before="0" w:line="240"/>
+        <w:ind w:left="120"/>
+      </w:pPr>
+      <w:r>
+        <w:rPr>
+          <w:rFonts w:ascii="Consolas" w:eastAsia="Microsoft YaHei" w:hAnsi="Consolas"/>
+          <w:color w:val="123F51"/>
+          <w:sz w:val="18"/>
+          <w:szCs w:val="18"/>
+        </w:rPr>
+        <w:t xml:space="preserve"># 进入指定文件夹，后面的命令将在这个目录里运行。
 </w:t>
       </w:r>
     </w:p>
@@ -921,743 +2496,56 @@
         <w:spacing w:after="90" w:before="90" w:line="290"/>
       </w:pPr>
       <w:r>
-        <w:t xml:space="preserve">命令解释：新终端重新进入个人工程，不依赖 A 中的变量。
-</w:t>
-      </w:r>
-    </w:p>
-    <w:p>
-      <w:pPr>
-        <w:spacing w:after="90" w:before="90" w:line="290"/>
-      </w:pPr>
-      <w:r>
-        <w:t xml:space="preserve">后续代码修改都在左侧编辑器完成。每改一处按 Ctrl+S 保存，再回浏览器按 Ctrl+R 刷新；第 1—5 课的服务不会替你自动刷新。关闭 A 或按 Ctrl+C 后网页服务会停止，再次使用要重跑 npm.cmd run dev。
-</w:t>
-      </w:r>
-    </w:p>
-    <w:p>
-      <w:pPr>
-        <w:spacing w:after="90" w:before="90" w:line="290"/>
-      </w:pPr>
-      <w:r>
-        <w:t xml:space="preserve">## 5. 具体开发：找到原文，再替换代码
-</w:t>
-      </w:r>
-    </w:p>
-    <w:p>
-      <w:pPr>
-        <w:spacing w:after="90" w:before="90" w:line="290"/>
-      </w:pPr>
-      <w:r>
-        <w:t xml:space="preserve">通用手势：点击 VS Code 左侧“资源管理器”图标，展开目录，单击指定文件。按 Ctrl+F 搜索给出的标记，按 Esc 关闭搜索框；鼠标选中需要替换的原文，把代码粘贴到编辑区，按 Ctrl+S。不要把代码粘贴进搜索框或终端。
-</w:t>
-      </w:r>
-    </w:p>
-    <w:p>
-      <w:pPr>
-        <w:spacing w:after="90" w:before="90" w:line="290"/>
-      </w:pPr>
-      <w:r>
-        <w:t xml:space="preserve">代码示范用于带做。先说明自己预期网页发生什么变化，再输入、保存并观察；完成后至少做一处个人修改，解释修改理由。
-</w:t>
-      </w:r>
-    </w:p>
-    <w:p>
-      <w:pPr>
-        <w:spacing w:after="90" w:before="90" w:line="290"/>
-      </w:pPr>
-      <w:r>
-        <w:t xml:space="preserve">### 5.1 先改网页主标题，确认自己编辑的是正确文件
-</w:t>
-      </w:r>
-    </w:p>
-    <w:p>
-      <w:pPr>
-        <w:spacing w:after="90" w:before="90" w:line="290"/>
-      </w:pPr>
-      <w:r>
-        <w:t xml:space="preserve">打开 index.html，Ctrl+F 搜索“你好，我是林晓”。只改标签之间的文字，例如把整行改成下面这样。周小禾是示例名，你可以使用自己的公开展示名。
-</w:t>
-      </w:r>
-    </w:p>
-    <w:p>
-      <w:pPr>
-        <w:shd w:fill="F1F5F8" w:val="clear"/>
-        <w:spacing w:after="0" w:before="0" w:line="240"/>
-        <w:ind w:left="120"/>
-      </w:pPr>
-      <w:r>
-        <w:rPr>
-          <w:rFonts w:ascii="Consolas" w:eastAsia="Microsoft YaHei" w:hAnsi="Consolas"/>
-          <w:color w:val="123F51"/>
-          <w:sz w:val="18"/>
-          <w:szCs w:val="18"/>
-        </w:rPr>
-        <w:t xml:space="preserve">    &lt;h1&gt;你好，我是周小禾&lt;/h1&gt;
-</w:t>
-      </w:r>
-    </w:p>
-    <w:p>
-      <w:pPr>
-        <w:spacing w:after="90" w:before="90" w:line="290"/>
-      </w:pPr>
-      <w:r>
-        <w:t xml:space="preserve">保存并刷新，页面大标题应立即改变。若没变：先看编辑器是否打开 p1-portfolio，文件标签是否还有未保存圆点，再看浏览器是不是 A 中的 Local 地址。
-</w:t>
-      </w:r>
-    </w:p>
-    <w:p>
-      <w:pPr>
-        <w:spacing w:after="90" w:before="90" w:line="290"/>
-      </w:pPr>
-      <w:r>
-        <w:t xml:space="preserve">随后 Ctrl+F 搜索其余“林晓”，逐处修改 title、description 和 footer 中的展示名。只改文字，保留标签与属性引号。联系信息可以继续使用模板中的虚构演示邮箱。
-</w:t>
-      </w:r>
-    </w:p>
-    <w:p>
-      <w:pPr>
-        <w:spacing w:after="90" w:before="90" w:line="290"/>
-      </w:pPr>
-      <w:r>
-        <w:t xml:space="preserve">### 5.2 修改 index.html
-</w:t>
-      </w:r>
-    </w:p>
-    <w:p>
-      <w:pPr>
-        <w:spacing w:after="90" w:before="90" w:line="290"/>
-      </w:pPr>
-      <w:r>
-        <w:t xml:space="preserve">打开 p1-portfolio/index.html。搜索 TODO-L1，找到下面这段原文。只选中这段，不要选中相邻函数或其他区块。
-</w:t>
-      </w:r>
-    </w:p>
-    <w:p>
-      <w:pPr>
-        <w:spacing w:after="90" w:before="90" w:line="290"/>
-      </w:pPr>
-      <w:r>
-        <w:t xml:space="preserve">修改前：
-</w:t>
-      </w:r>
-    </w:p>
-    <w:p>
-      <w:pPr>
-        <w:shd w:fill="F1F5F8" w:val="clear"/>
-        <w:spacing w:after="0" w:before="0" w:line="240"/>
-        <w:ind w:left="120"/>
-      </w:pPr>
-      <w:r>
-        <w:rPr>
-          <w:rFonts w:ascii="Consolas" w:eastAsia="Microsoft YaHei" w:hAnsi="Consolas"/>
-          <w:color w:val="123F51"/>
-          <w:sz w:val="18"/>
-          <w:szCs w:val="18"/>
-        </w:rPr>
-        <w:t xml:space="preserve">&lt;!-- TODO-L1: 在这里编写 about-title 对应的完整 section --&gt;
-</w:t>
-      </w:r>
-    </w:p>
-    <w:p>
-      <w:pPr>
-        <w:spacing w:after="90" w:before="90" w:line="290"/>
-      </w:pPr>
-      <w:r>
-        <w:t xml:space="preserve">替换成：
-</w:t>
-      </w:r>
-    </w:p>
-    <w:p>
-      <w:pPr>
-        <w:shd w:fill="F1F5F8" w:val="clear"/>
-        <w:spacing w:after="0" w:before="0" w:line="240"/>
-        <w:ind w:left="120"/>
-      </w:pPr>
-      <w:r>
-        <w:rPr>
-          <w:rFonts w:ascii="Consolas" w:eastAsia="Microsoft YaHei" w:hAnsi="Consolas"/>
-          <w:color w:val="123F51"/>
-          <w:sz w:val="18"/>
-          <w:szCs w:val="18"/>
-        </w:rPr>
-        <w:t xml:space="preserve">&lt;section aria-labelledby="about-title"&gt;
-</w:t>
-      </w:r>
-    </w:p>
-    <w:p>
-      <w:pPr>
-        <w:shd w:fill="F1F5F8" w:val="clear"/>
-        <w:spacing w:after="0" w:before="0" w:line="240"/>
-        <w:ind w:left="120"/>
-      </w:pPr>
-      <w:r>
-        <w:rPr>
-          <w:rFonts w:ascii="Consolas" w:eastAsia="Microsoft YaHei" w:hAnsi="Consolas"/>
-          <w:color w:val="123F51"/>
-          <w:sz w:val="18"/>
-          <w:szCs w:val="18"/>
-        </w:rPr>
-        <w:t xml:space="preserve">      &lt;h2 id="about-title"&gt;关于我&lt;/h2&gt;
-</w:t>
-      </w:r>
-    </w:p>
-    <w:p>
-      <w:pPr>
-        <w:shd w:fill="F1F5F8" w:val="clear"/>
-        <w:spacing w:after="0" w:before="0" w:line="240"/>
-        <w:ind w:left="120"/>
-      </w:pPr>
-      <w:r>
-        <w:rPr>
-          <w:rFonts w:ascii="Consolas" w:eastAsia="Microsoft YaHei" w:hAnsi="Consolas"/>
-          <w:color w:val="123F51"/>
-          <w:sz w:val="18"/>
-          <w:szCs w:val="18"/>
-        </w:rPr>
-        <w:t xml:space="preserve">      &lt;p&gt;我正在学习 HTML、CSS、JavaScript 与软件发布，希望成长为重视用户体验的前端开发者。&lt;/p&gt;
-</w:t>
-      </w:r>
-    </w:p>
-    <w:p>
-      <w:pPr>
-        <w:shd w:fill="F1F5F8" w:val="clear"/>
-        <w:spacing w:after="0" w:before="0" w:line="240"/>
-        <w:ind w:left="120"/>
-      </w:pPr>
-      <w:r>
-        <w:rPr>
-          <w:rFonts w:ascii="Consolas" w:eastAsia="Microsoft YaHei" w:hAnsi="Consolas"/>
-          <w:color w:val="123F51"/>
-          <w:sz w:val="18"/>
-          <w:szCs w:val="18"/>
-        </w:rPr>
-        <w:t xml:space="preserve">    &lt;/section&gt;
-</w:t>
-      </w:r>
-    </w:p>
-    <w:p>
-      <w:pPr>
-        <w:spacing w:after="90" w:before="90" w:line="290"/>
-      </w:pPr>
-      <w:r>
-        <w:t xml:space="preserve">代码解释：section 是一个主题区块，h2 是区块标题。aria-labelledby 的值要与 h2 的 id 完全相同。p 中写自己的介绍。
-</w:t>
-      </w:r>
-    </w:p>
-    <w:p>
-      <w:pPr>
-        <w:spacing w:after="90" w:before="90" w:line="290"/>
-      </w:pPr>
-      <w:r>
-        <w:t xml:space="preserve">按 Ctrl+S 保存，回浏览器 Ctrl+R 刷新，再做下方检查。
-</w:t>
-      </w:r>
-    </w:p>
-    <w:p>
-      <w:pPr>
-        <w:spacing w:after="90" w:before="90" w:line="290"/>
-      </w:pPr>
-      <w:r>
-        <w:t xml:space="preserve">### 5.3 修改 index.html
-</w:t>
-      </w:r>
-    </w:p>
-    <w:p>
-      <w:pPr>
-        <w:spacing w:after="90" w:before="90" w:line="290"/>
-      </w:pPr>
-      <w:r>
-        <w:t xml:space="preserve">打开 p1-portfolio/index.html。搜索 TODO-L1，找到下面这段原文。只选中这段，不要选中相邻函数或其他区块。
-</w:t>
-      </w:r>
-    </w:p>
-    <w:p>
-      <w:pPr>
-        <w:spacing w:after="90" w:before="90" w:line="290"/>
-      </w:pPr>
-      <w:r>
-        <w:t xml:space="preserve">修改前：
-</w:t>
-      </w:r>
-    </w:p>
-    <w:p>
-      <w:pPr>
-        <w:shd w:fill="F1F5F8" w:val="clear"/>
-        <w:spacing w:after="0" w:before="0" w:line="240"/>
-        <w:ind w:left="120"/>
-      </w:pPr>
-      <w:r>
-        <w:rPr>
-          <w:rFonts w:ascii="Consolas" w:eastAsia="Microsoft YaHei" w:hAnsi="Consolas"/>
-          <w:color w:val="123F51"/>
-          <w:sz w:val="18"/>
-          <w:szCs w:val="18"/>
-        </w:rPr>
-        <w:t xml:space="preserve">&lt;!-- TODO-L1: 在这里编写 skills-title 对应的完整 section --&gt;
-</w:t>
-      </w:r>
-    </w:p>
-    <w:p>
-      <w:pPr>
-        <w:spacing w:after="90" w:before="90" w:line="290"/>
-      </w:pPr>
-      <w:r>
-        <w:t xml:space="preserve">替换成：
-</w:t>
-      </w:r>
-    </w:p>
-    <w:p>
-      <w:pPr>
-        <w:shd w:fill="F1F5F8" w:val="clear"/>
-        <w:spacing w:after="0" w:before="0" w:line="240"/>
-        <w:ind w:left="120"/>
-      </w:pPr>
-      <w:r>
-        <w:rPr>
-          <w:rFonts w:ascii="Consolas" w:eastAsia="Microsoft YaHei" w:hAnsi="Consolas"/>
-          <w:color w:val="123F51"/>
-          <w:sz w:val="18"/>
-          <w:szCs w:val="18"/>
-        </w:rPr>
-        <w:t xml:space="preserve">&lt;section aria-labelledby="skills-title"&gt;
-</w:t>
-      </w:r>
-    </w:p>
-    <w:p>
-      <w:pPr>
-        <w:shd w:fill="F1F5F8" w:val="clear"/>
-        <w:spacing w:after="0" w:before="0" w:line="240"/>
-        <w:ind w:left="120"/>
-      </w:pPr>
-      <w:r>
-        <w:rPr>
-          <w:rFonts w:ascii="Consolas" w:eastAsia="Microsoft YaHei" w:hAnsi="Consolas"/>
-          <w:color w:val="123F51"/>
-          <w:sz w:val="18"/>
-          <w:szCs w:val="18"/>
-        </w:rPr>
-        <w:t xml:space="preserve">      &lt;h2 id="skills-title"&gt;正在掌握&lt;/h2&gt;
-</w:t>
-      </w:r>
-    </w:p>
-    <w:p>
-      <w:pPr>
-        <w:shd w:fill="F1F5F8" w:val="clear"/>
-        <w:spacing w:after="0" w:before="0" w:line="240"/>
-        <w:ind w:left="120"/>
-      </w:pPr>
-      <w:r>
-        <w:rPr>
-          <w:rFonts w:ascii="Consolas" w:eastAsia="Microsoft YaHei" w:hAnsi="Consolas"/>
-          <w:color w:val="123F51"/>
-          <w:sz w:val="18"/>
-          <w:szCs w:val="18"/>
-        </w:rPr>
-        <w:t xml:space="preserve">      &lt;ul class="tag-list"&gt;
-</w:t>
-      </w:r>
-    </w:p>
-    <w:p>
-      <w:pPr>
-        <w:shd w:fill="F1F5F8" w:val="clear"/>
-        <w:spacing w:after="0" w:before="0" w:line="240"/>
-        <w:ind w:left="120"/>
-      </w:pPr>
-      <w:r>
-        <w:rPr>
-          <w:rFonts w:ascii="Consolas" w:eastAsia="Microsoft YaHei" w:hAnsi="Consolas"/>
-          <w:color w:val="123F51"/>
-          <w:sz w:val="18"/>
-          <w:szCs w:val="18"/>
-        </w:rPr>
-        <w:t xml:space="preserve">        &lt;li&gt;语义化 HTML&lt;/li&gt;
-</w:t>
-      </w:r>
-    </w:p>
-    <w:p>
-      <w:pPr>
-        <w:shd w:fill="F1F5F8" w:val="clear"/>
-        <w:spacing w:after="0" w:before="0" w:line="240"/>
-        <w:ind w:left="120"/>
-      </w:pPr>
-      <w:r>
-        <w:rPr>
-          <w:rFonts w:ascii="Consolas" w:eastAsia="Microsoft YaHei" w:hAnsi="Consolas"/>
-          <w:color w:val="123F51"/>
-          <w:sz w:val="18"/>
-          <w:szCs w:val="18"/>
-        </w:rPr>
-        <w:t xml:space="preserve">        &lt;li&gt;响应式 CSS&lt;/li&gt;
-</w:t>
-      </w:r>
-    </w:p>
-    <w:p>
-      <w:pPr>
-        <w:shd w:fill="F1F5F8" w:val="clear"/>
-        <w:spacing w:after="0" w:before="0" w:line="240"/>
-        <w:ind w:left="120"/>
-      </w:pPr>
-      <w:r>
-        <w:rPr>
-          <w:rFonts w:ascii="Consolas" w:eastAsia="Microsoft YaHei" w:hAnsi="Consolas"/>
-          <w:color w:val="123F51"/>
-          <w:sz w:val="18"/>
-          <w:szCs w:val="18"/>
-        </w:rPr>
-        <w:t xml:space="preserve">        &lt;li&gt;Git 与 GitHub&lt;/li&gt;
-</w:t>
-      </w:r>
-    </w:p>
-    <w:p>
-      <w:pPr>
-        <w:shd w:fill="F1F5F8" w:val="clear"/>
-        <w:spacing w:after="0" w:before="0" w:line="240"/>
-        <w:ind w:left="120"/>
-      </w:pPr>
-      <w:r>
-        <w:rPr>
-          <w:rFonts w:ascii="Consolas" w:eastAsia="Microsoft YaHei" w:hAnsi="Consolas"/>
-          <w:color w:val="123F51"/>
-          <w:sz w:val="18"/>
-          <w:szCs w:val="18"/>
-        </w:rPr>
-        <w:t xml:space="preserve">      &lt;/ul&gt;
-</w:t>
-      </w:r>
-    </w:p>
-    <w:p>
-      <w:pPr>
-        <w:shd w:fill="F1F5F8" w:val="clear"/>
-        <w:spacing w:after="0" w:before="0" w:line="240"/>
-        <w:ind w:left="120"/>
-      </w:pPr>
-      <w:r>
-        <w:rPr>
-          <w:rFonts w:ascii="Consolas" w:eastAsia="Microsoft YaHei" w:hAnsi="Consolas"/>
-          <w:color w:val="123F51"/>
-          <w:sz w:val="18"/>
-          <w:szCs w:val="18"/>
-        </w:rPr>
-        <w:t xml:space="preserve">    &lt;/section&gt;
-</w:t>
-      </w:r>
-    </w:p>
-    <w:p>
-      <w:pPr>
-        <w:spacing w:after="90" w:before="90" w:line="290"/>
-      </w:pPr>
-      <w:r>
-        <w:t xml:space="preserve">代码解释：section 是一个主题区块，h2 是区块标题。aria-labelledby 的值要与 h2 的 id 完全相同。ul 是列表，每个 li 是一项技能，至少保留两项。
-</w:t>
-      </w:r>
-    </w:p>
-    <w:p>
-      <w:pPr>
-        <w:spacing w:after="90" w:before="90" w:line="290"/>
-      </w:pPr>
-      <w:r>
-        <w:t xml:space="preserve">按 Ctrl+S 保存，回浏览器 Ctrl+R 刷新，再做下方检查。
-</w:t>
-      </w:r>
-    </w:p>
-    <w:p>
-      <w:pPr>
-        <w:spacing w:after="90" w:before="90" w:line="290"/>
-      </w:pPr>
-      <w:r>
-        <w:t xml:space="preserve">### 5.4 修改 styles.css
-</w:t>
-      </w:r>
-    </w:p>
-    <w:p>
-      <w:pPr>
-        <w:spacing w:after="90" w:before="90" w:line="290"/>
-      </w:pPr>
-      <w:r>
-        <w:t xml:space="preserve">打开 p1-portfolio/styles.css。搜索 section {，在这个样式区块内找到 padding: 24px;。只改这一行，不改其他选择器中的 padding。
-</w:t>
-      </w:r>
-    </w:p>
-    <w:p>
-      <w:pPr>
-        <w:spacing w:after="90" w:before="90" w:line="290"/>
-      </w:pPr>
-      <w:r>
-        <w:t xml:space="preserve">修改前：
-</w:t>
-      </w:r>
-    </w:p>
-    <w:p>
-      <w:pPr>
-        <w:shd w:fill="F1F5F8" w:val="clear"/>
-        <w:spacing w:after="0" w:before="0" w:line="240"/>
-        <w:ind w:left="120"/>
-      </w:pPr>
-      <w:r>
-        <w:rPr>
-          <w:rFonts w:ascii="Consolas" w:eastAsia="Microsoft YaHei" w:hAnsi="Consolas"/>
-          <w:color w:val="123F51"/>
-          <w:sz w:val="18"/>
-          <w:szCs w:val="18"/>
-        </w:rPr>
-        <w:t xml:space="preserve">padding: 24px;
-</w:t>
-      </w:r>
-    </w:p>
-    <w:p>
-      <w:pPr>
-        <w:spacing w:after="90" w:before="90" w:line="290"/>
-      </w:pPr>
-      <w:r>
-        <w:t xml:space="preserve">替换成：
-</w:t>
-      </w:r>
-    </w:p>
-    <w:p>
-      <w:pPr>
-        <w:shd w:fill="F1F5F8" w:val="clear"/>
-        <w:spacing w:after="0" w:before="0" w:line="240"/>
-        <w:ind w:left="120"/>
-      </w:pPr>
-      <w:r>
-        <w:rPr>
-          <w:rFonts w:ascii="Consolas" w:eastAsia="Microsoft YaHei" w:hAnsi="Consolas"/>
-          <w:color w:val="123F51"/>
-          <w:sz w:val="18"/>
-          <w:szCs w:val="18"/>
-        </w:rPr>
-        <w:t xml:space="preserve">padding: 28px;
-</w:t>
-      </w:r>
-    </w:p>
-    <w:p>
-      <w:pPr>
-        <w:spacing w:after="90" w:before="90" w:line="290"/>
-      </w:pPr>
-      <w:r>
-        <w:t xml:space="preserve">代码解释：只替换 section { ... } 中这一行。padding 控制卡片内容与边框的距离，单位 px 是像素。
-</w:t>
-      </w:r>
-    </w:p>
-    <w:p>
-      <w:pPr>
-        <w:spacing w:after="90" w:before="90" w:line="290"/>
-      </w:pPr>
-      <w:r>
-        <w:t xml:space="preserve">按 Ctrl+S 保存，回浏览器 Ctrl+R 刷新，再做下方检查。
-</w:t>
-      </w:r>
-    </w:p>
-    <w:p>
-      <w:pPr>
-        <w:spacing w:after="90" w:before="90" w:line="290"/>
-      </w:pPr>
-      <w:r>
-        <w:t xml:space="preserve">### 5.6 逐项观察结果
-</w:t>
-      </w:r>
-    </w:p>
-    <w:p>
-      <w:pPr>
-        <w:spacing w:after="90" w:before="90" w:line="290"/>
-      </w:pPr>
-      <w:r>
-        <w:t xml:space="preserve">页面出现“关于我”和“正在掌握”两个区块，至少两项技能。卡片内容距离边框比原来稍远。用 Tab 键移动到链接，应能看到黄色焦点框。第一段完成后回 PPT 第 23 页；间距与键盘检查完成后回第 27 页。
-</w:t>
-      </w:r>
-    </w:p>
-    <w:p>
-      <w:pPr>
-        <w:spacing w:after="90" w:before="90" w:line="290"/>
-      </w:pPr>
-      <w:r>
-        <w:t xml:space="preserve">### 5.7 写下本次改动
-</w:t>
-      </w:r>
-    </w:p>
-    <w:p>
-      <w:pPr>
-        <w:spacing w:after="90" w:before="90" w:line="290"/>
-      </w:pPr>
-      <w:r>
-        <w:t xml:space="preserve">在左侧打开 README.md，按 Ctrl+End 到文件末尾，新起一行追加下面这段。把示例中的说明改成你的实际操作，不要覆盖原有安装和运行说明。
-</w:t>
-      </w:r>
-    </w:p>
-    <w:p>
-      <w:pPr>
-        <w:shd w:fill="F1F5F8" w:val="clear"/>
-        <w:spacing w:after="0" w:before="0" w:line="240"/>
-        <w:ind w:left="120"/>
-      </w:pPr>
-      <w:r>
-        <w:rPr>
-          <w:rFonts w:ascii="Consolas" w:eastAsia="Microsoft YaHei" w:hAnsi="Consolas"/>
-          <w:color w:val="123F51"/>
-          <w:sz w:val="18"/>
-          <w:szCs w:val="18"/>
-        </w:rPr>
-        <w:t xml:space="preserve">## 我的本课记录
-</w:t>
-      </w:r>
-    </w:p>
-    <w:p>
-      <w:pPr>
-        <w:shd w:fill="F1F5F8" w:val="clear"/>
-        <w:spacing w:after="0" w:before="0" w:line="240"/>
-        <w:ind w:left="120"/>
-      </w:pPr>
-      <w:r>
-        <w:rPr>
-          <w:rFonts w:ascii="Consolas" w:eastAsia="Microsoft YaHei" w:hAnsi="Consolas"/>
-          <w:color w:val="123F51"/>
-          <w:sz w:val="18"/>
-          <w:szCs w:val="18"/>
-        </w:rPr>
-        <w:t xml:space="preserve">
-</w:t>
-      </w:r>
-    </w:p>
-    <w:p>
-      <w:pPr>
-        <w:shd w:fill="F1F5F8" w:val="clear"/>
-        <w:spacing w:after="0" w:before="0" w:line="240"/>
-        <w:ind w:left="120"/>
-      </w:pPr>
-      <w:r>
-        <w:rPr>
-          <w:rFonts w:ascii="Consolas" w:eastAsia="Microsoft YaHei" w:hAnsi="Consolas"/>
-          <w:color w:val="123F51"/>
-          <w:sz w:val="18"/>
-          <w:szCs w:val="18"/>
-        </w:rPr>
-        <w:t xml:space="preserve">展示名：周小禾
-</w:t>
-      </w:r>
-    </w:p>
-    <w:p>
-      <w:pPr>
-        <w:shd w:fill="F1F5F8" w:val="clear"/>
-        <w:spacing w:after="0" w:before="0" w:line="240"/>
-        <w:ind w:left="120"/>
-      </w:pPr>
-      <w:r>
-        <w:rPr>
-          <w:rFonts w:ascii="Consolas" w:eastAsia="Microsoft YaHei" w:hAnsi="Consolas"/>
-          <w:color w:val="123F51"/>
-          <w:sz w:val="18"/>
-          <w:szCs w:val="18"/>
-        </w:rPr>
-        <w:t xml:space="preserve">我修改的文件：填写实际文件名
-</w:t>
-      </w:r>
-    </w:p>
-    <w:p>
-      <w:pPr>
-        <w:shd w:fill="F1F5F8" w:val="clear"/>
-        <w:spacing w:after="0" w:before="0" w:line="240"/>
-        <w:ind w:left="120"/>
-      </w:pPr>
-      <w:r>
-        <w:rPr>
-          <w:rFonts w:ascii="Consolas" w:eastAsia="Microsoft YaHei" w:hAnsi="Consolas"/>
-          <w:color w:val="123F51"/>
-          <w:sz w:val="18"/>
-          <w:szCs w:val="18"/>
-        </w:rPr>
-        <w:t xml:space="preserve">修改目的：填写希望用户看到的变化
-</w:t>
-      </w:r>
-    </w:p>
-    <w:p>
-      <w:pPr>
-        <w:shd w:fill="F1F5F8" w:val="clear"/>
-        <w:spacing w:after="0" w:before="0" w:line="240"/>
-        <w:ind w:left="120"/>
-      </w:pPr>
-      <w:r>
-        <w:rPr>
-          <w:rFonts w:ascii="Consolas" w:eastAsia="Microsoft YaHei" w:hAnsi="Consolas"/>
-          <w:color w:val="123F51"/>
-          <w:sz w:val="18"/>
-          <w:szCs w:val="18"/>
-        </w:rPr>
-        <w:t xml:space="preserve">验证方法：填写自己实际执行的检查
-</w:t>
-      </w:r>
-    </w:p>
-    <w:p>
-      <w:pPr>
-        <w:shd w:fill="F1F5F8" w:val="clear"/>
-        <w:spacing w:after="0" w:before="0" w:line="240"/>
-        <w:ind w:left="120"/>
-      </w:pPr>
-      <w:r>
-        <w:rPr>
-          <w:rFonts w:ascii="Consolas" w:eastAsia="Microsoft YaHei" w:hAnsi="Consolas"/>
-          <w:color w:val="123F51"/>
-          <w:sz w:val="18"/>
-          <w:szCs w:val="18"/>
-        </w:rPr>
-        <w:t xml:space="preserve">结果：填写页面变化或错误修复情况
-</w:t>
-      </w:r>
-    </w:p>
-    <w:p>
-      <w:pPr>
-        <w:spacing w:after="90" w:before="90" w:line="290"/>
-      </w:pPr>
-      <w:r>
-        <w:t xml:space="preserve">这一步让下一位同学或未来的自己能理解本次修改。填完 Ctrl+S 保存。
-</w:t>
-      </w:r>
-    </w:p>
-    <w:p>
-      <w:pPr>
-        <w:spacing w:after="90" w:before="90" w:line="290"/>
-      </w:pPr>
-      <w:r>
-        <w:t xml:space="preserve">## 6. 检查后再提交
-</w:t>
-      </w:r>
-    </w:p>
-    <w:p>
-      <w:pPr>
-        <w:spacing w:after="90" w:before="90" w:line="290"/>
-      </w:pPr>
-      <w:r>
-        <w:t xml:space="preserve">位置：PowerShell 终端 B。A 继续运行网页。
-</w:t>
-      </w:r>
-    </w:p>
-    <w:p>
-      <w:pPr>
-        <w:shd w:fill="F1F5F8" w:val="clear"/>
-        <w:spacing w:after="0" w:before="0" w:line="240"/>
-        <w:ind w:left="120"/>
-      </w:pPr>
-      <w:r>
-        <w:rPr>
-          <w:rFonts w:ascii="Consolas" w:eastAsia="Microsoft YaHei" w:hAnsi="Consolas"/>
-          <w:color w:val="123F51"/>
-          <w:sz w:val="18"/>
-          <w:szCs w:val="18"/>
-        </w:rPr>
-        <w:t xml:space="preserve">Set-Location (Join-Path $env:USERPROFILE 'web-work/p1-portfolio')
-</w:t>
-      </w:r>
-    </w:p>
-    <w:p>
-      <w:pPr>
-        <w:spacing w:after="90" w:before="90" w:line="290"/>
-      </w:pPr>
-      <w:r>
         <w:t xml:space="preserve">命令解释：回到个人工程根目录。
 </w:t>
       </w:r>
     </w:p>
     <w:p>
       <w:pPr>
+        <w:spacing w:after="90" w:before="90" w:line="290"/>
+      </w:pPr>
+      <w:r>
+        <w:t xml:space="preserve">运行平台：Windows 10/11 · PowerShell。输入位置：VS Code 下方的 PowerShell 终端。
+</w:t>
+      </w:r>
+    </w:p>
+    <w:p>
+      <w:pPr>
+        <w:spacing w:after="90" w:before="90" w:line="290"/>
+      </w:pPr>
+      <w:r>
+        <w:t xml:space="preserve">当前目录：web-work/p1-portfolio（自己的开发工程）
+</w:t>
+      </w:r>
+    </w:p>
+    <w:p>
+      <w:pPr>
+        <w:spacing w:after="90" w:before="90" w:line="290"/>
+      </w:pPr>
+      <w:r>
+        <w:t xml:space="preserve">运行方法：点击终端最后一行，粘贴本代码框并按 Enter；# 开头是注释，可以一起复制。看到预期结果后再做下一步。
+</w:t>
+      </w:r>
+    </w:p>
+    <w:p>
+      <w:pPr>
+        <w:shd w:fill="F1F5F8" w:val="clear"/>
+        <w:spacing w:after="0" w:before="0" w:line="240"/>
+        <w:ind w:left="120"/>
+      </w:pPr>
+      <w:r>
+        <w:rPr>
+          <w:rFonts w:ascii="Consolas" w:eastAsia="Microsoft YaHei" w:hAnsi="Consolas"/>
+          <w:color w:val="123F51"/>
+          <w:sz w:val="18"/>
+          <w:szCs w:val="18"/>
+        </w:rPr>
+        <w:t xml:space="preserve"># 检查本课要自己完成的任务，未完成时会报错。
+</w:t>
+      </w:r>
+    </w:p>
+    <w:p>
+      <w:pPr>
         <w:shd w:fill="F1F5F8" w:val="clear"/>
         <w:spacing w:after="0" w:before="0" w:line="240"/>
         <w:ind w:left="120"/>
@@ -1693,6 +2581,50 @@
     </w:p>
     <w:p>
       <w:pPr>
+        <w:spacing w:after="90" w:before="90" w:line="290"/>
+      </w:pPr>
+      <w:r>
+        <w:t xml:space="preserve">运行平台：Windows 10/11 · PowerShell。输入位置：VS Code 下方的 PowerShell 终端。
+</w:t>
+      </w:r>
+    </w:p>
+    <w:p>
+      <w:pPr>
+        <w:spacing w:after="90" w:before="90" w:line="290"/>
+      </w:pPr>
+      <w:r>
+        <w:t xml:space="preserve">当前目录：web-work/p1-portfolio（自己的开发工程）
+</w:t>
+      </w:r>
+    </w:p>
+    <w:p>
+      <w:pPr>
+        <w:spacing w:after="90" w:before="90" w:line="290"/>
+      </w:pPr>
+      <w:r>
+        <w:t xml:space="preserve">运行方法：点击终端最后一行，粘贴本代码框并按 Enter；# 开头是注释，可以一起复制。看到预期结果后再做下一步。
+</w:t>
+      </w:r>
+    </w:p>
+    <w:p>
+      <w:pPr>
+        <w:shd w:fill="F1F5F8" w:val="clear"/>
+        <w:spacing w:after="0" w:before="0" w:line="240"/>
+        <w:ind w:left="120"/>
+      </w:pPr>
+      <w:r>
+        <w:rPr>
+          <w:rFonts w:ascii="Consolas" w:eastAsia="Microsoft YaHei" w:hAnsi="Consolas"/>
+          <w:color w:val="123F51"/>
+          <w:sz w:val="18"/>
+          <w:szCs w:val="18"/>
+        </w:rPr>
+        <w:t xml:space="preserve"># 运行项目提供的结构检查。
+</w:t>
+      </w:r>
+    </w:p>
+    <w:p>
+      <w:pPr>
         <w:shd w:fill="F1F5F8" w:val="clear"/>
         <w:spacing w:after="0" w:before="0" w:line="240"/>
         <w:ind w:left="120"/>
@@ -1728,6 +2660,50 @@
     </w:p>
     <w:p>
       <w:pPr>
+        <w:spacing w:after="90" w:before="90" w:line="290"/>
+      </w:pPr>
+      <w:r>
+        <w:t xml:space="preserve">运行平台：Windows 10/11 · PowerShell。输入位置：VS Code 下方的 PowerShell 终端。
+</w:t>
+      </w:r>
+    </w:p>
+    <w:p>
+      <w:pPr>
+        <w:spacing w:after="90" w:before="90" w:line="290"/>
+      </w:pPr>
+      <w:r>
+        <w:t xml:space="preserve">当前目录：web-work/p1-portfolio（自己的开发工程）
+</w:t>
+      </w:r>
+    </w:p>
+    <w:p>
+      <w:pPr>
+        <w:spacing w:after="90" w:before="90" w:line="290"/>
+      </w:pPr>
+      <w:r>
+        <w:t xml:space="preserve">运行方法：点击终端最后一行，粘贴本代码框并按 Enter；# 开头是注释，可以一起复制。看到预期结果后再做下一步。
+</w:t>
+      </w:r>
+    </w:p>
+    <w:p>
+      <w:pPr>
+        <w:shd w:fill="F1F5F8" w:val="clear"/>
+        <w:spacing w:after="0" w:before="0" w:line="240"/>
+        <w:ind w:left="120"/>
+      </w:pPr>
+      <w:r>
+        <w:rPr>
+          <w:rFonts w:ascii="Consolas" w:eastAsia="Microsoft YaHei" w:hAnsi="Consolas"/>
+          <w:color w:val="123F51"/>
+          <w:sz w:val="18"/>
+          <w:szCs w:val="18"/>
+        </w:rPr>
+        <w:t xml:space="preserve"># 运行项目提供的自动测试。
+</w:t>
+      </w:r>
+    </w:p>
+    <w:p>
+      <w:pPr>
         <w:shd w:fill="F1F5F8" w:val="clear"/>
         <w:spacing w:after="0" w:before="0" w:line="240"/>
         <w:ind w:left="120"/>
@@ -1763,6 +2739,50 @@
     </w:p>
     <w:p>
       <w:pPr>
+        <w:spacing w:after="90" w:before="90" w:line="290"/>
+      </w:pPr>
+      <w:r>
+        <w:t xml:space="preserve">运行平台：Windows 10/11 · PowerShell。输入位置：VS Code 下方的 PowerShell 终端。
+</w:t>
+      </w:r>
+    </w:p>
+    <w:p>
+      <w:pPr>
+        <w:spacing w:after="90" w:before="90" w:line="290"/>
+      </w:pPr>
+      <w:r>
+        <w:t xml:space="preserve">当前目录：web-work/p1-portfolio（自己的开发工程）
+</w:t>
+      </w:r>
+    </w:p>
+    <w:p>
+      <w:pPr>
+        <w:spacing w:after="90" w:before="90" w:line="290"/>
+      </w:pPr>
+      <w:r>
+        <w:t xml:space="preserve">运行方法：点击终端最后一行，粘贴本代码框并按 Enter；# 开头是注释，可以一起复制。看到预期结果后再做下一步。
+</w:t>
+      </w:r>
+    </w:p>
+    <w:p>
+      <w:pPr>
+        <w:shd w:fill="F1F5F8" w:val="clear"/>
+        <w:spacing w:after="0" w:before="0" w:line="240"/>
+        <w:ind w:left="120"/>
+      </w:pPr>
+      <w:r>
+        <w:rPr>
+          <w:rFonts w:ascii="Consolas" w:eastAsia="Microsoft YaHei" w:hAnsi="Consolas"/>
+          <w:color w:val="123F51"/>
+          <w:sz w:val="18"/>
+          <w:szCs w:val="18"/>
+        </w:rPr>
+        <w:t xml:space="preserve"># 生成 dist 文件夹中的部署文件。
+</w:t>
+      </w:r>
+    </w:p>
+    <w:p>
+      <w:pPr>
         <w:shd w:fill="F1F5F8" w:val="clear"/>
         <w:spacing w:after="0" w:before="0" w:line="240"/>
         <w:ind w:left="120"/>
@@ -1798,6 +2818,50 @@
     </w:p>
     <w:p>
       <w:pPr>
+        <w:spacing w:after="90" w:before="90" w:line="290"/>
+      </w:pPr>
+      <w:r>
+        <w:t xml:space="preserve">运行平台：Windows 10/11 · PowerShell。输入位置：VS Code 下方的 PowerShell 终端。
+</w:t>
+      </w:r>
+    </w:p>
+    <w:p>
+      <w:pPr>
+        <w:spacing w:after="90" w:before="90" w:line="290"/>
+      </w:pPr>
+      <w:r>
+        <w:t xml:space="preserve">当前目录：web-work/p1-portfolio（自己的开发工程）
+</w:t>
+      </w:r>
+    </w:p>
+    <w:p>
+      <w:pPr>
+        <w:spacing w:after="90" w:before="90" w:line="290"/>
+      </w:pPr>
+      <w:r>
+        <w:t xml:space="preserve">运行方法：点击终端最后一行，粘贴本代码框并按 Enter；# 开头是注释，可以一起复制。看到预期结果后再做下一步。
+</w:t>
+      </w:r>
+    </w:p>
+    <w:p>
+      <w:pPr>
+        <w:shd w:fill="F1F5F8" w:val="clear"/>
+        <w:spacing w:after="0" w:before="0" w:line="240"/>
+        <w:ind w:left="120"/>
+      </w:pPr>
+      <w:r>
+        <w:rPr>
+          <w:rFonts w:ascii="Consolas" w:eastAsia="Microsoft YaHei" w:hAnsi="Consolas"/>
+          <w:color w:val="123F51"/>
+          <w:sz w:val="18"/>
+          <w:szCs w:val="18"/>
+        </w:rPr>
+        <w:t xml:space="preserve"># 检查路径是否存在，存在输出 True，不存在输出 False。
+</w:t>
+      </w:r>
+    </w:p>
+    <w:p>
+      <w:pPr>
         <w:shd w:fill="F1F5F8" w:val="clear"/>
         <w:spacing w:after="0" w:before="0" w:line="240"/>
         <w:ind w:left="120"/>
@@ -1856,7 +2920,7 @@
       <w:r>
         <w:t xml:space="preserve">位置：浏览器，登录自己的 GitHub 账号。打开 </w:t>
       </w:r>
-      <w:hyperlink w:history="1" r:id="rId5wdoe4a5w4ar_itdxnmmm">
+      <w:hyperlink w:history="1" r:id="rId8krpkrv7ung8gju-bkdvz">
         <w:r>
           <w:rPr>
             <w:rStyle w:val="Hyperlink"/>
@@ -1928,7 +2992,7 @@
         <w:spacing w:after="90" w:before="90" w:line="290"/>
       </w:pPr>
       <w:r>
-        <w:t xml:space="preserve">网址修改后，在 B 中重新执行第 6 步检查。然后在 B 中执行以下 Git 操作。
+        <w:t xml:space="preserve">网址修改后，在当前终端中重新执行第 6 步检查。然后在当前终端中执行以下 Git 操作。
 </w:t>
       </w:r>
     </w:p>
@@ -1952,6 +3016,50 @@
     </w:p>
     <w:p>
       <w:pPr>
+        <w:spacing w:after="90" w:before="90" w:line="290"/>
+      </w:pPr>
+      <w:r>
+        <w:t xml:space="preserve">运行平台：Windows 10/11 · PowerShell。输入位置：VS Code 下方的 PowerShell 终端。
+</w:t>
+      </w:r>
+    </w:p>
+    <w:p>
+      <w:pPr>
+        <w:spacing w:after="90" w:before="90" w:line="290"/>
+      </w:pPr>
+      <w:r>
+        <w:t xml:space="preserve">当前目录：web-work/p1-portfolio（自己的开发工程）
+</w:t>
+      </w:r>
+    </w:p>
+    <w:p>
+      <w:pPr>
+        <w:spacing w:after="90" w:before="90" w:line="290"/>
+      </w:pPr>
+      <w:r>
+        <w:t xml:space="preserve">运行方法：点击终端最后一行，粘贴本代码框并按 Enter；# 开头是注释，可以一起复制。看到预期结果后再做下一步。
+</w:t>
+      </w:r>
+    </w:p>
+    <w:p>
+      <w:pPr>
+        <w:shd w:fill="F1F5F8" w:val="clear"/>
+        <w:spacing w:after="0" w:before="0" w:line="240"/>
+        <w:ind w:left="120"/>
+      </w:pPr>
+      <w:r>
+        <w:rPr>
+          <w:rFonts w:ascii="Consolas" w:eastAsia="Microsoft YaHei" w:hAnsi="Consolas"/>
+          <w:color w:val="123F51"/>
+          <w:sz w:val="18"/>
+          <w:szCs w:val="18"/>
+        </w:rPr>
+        <w:t xml:space="preserve"># 首次建立个人 Git 仓库，-b main 指定主分支名称。
+</w:t>
+      </w:r>
+    </w:p>
+    <w:p>
+      <w:pPr>
         <w:shd w:fill="F1F5F8" w:val="clear"/>
         <w:spacing w:after="0" w:before="0" w:line="240"/>
         <w:ind w:left="120"/>
@@ -1987,6 +3095,50 @@
     </w:p>
     <w:p>
       <w:pPr>
+        <w:spacing w:after="90" w:before="90" w:line="290"/>
+      </w:pPr>
+      <w:r>
+        <w:t xml:space="preserve">运行平台：Windows 10/11 · PowerShell。输入位置：VS Code 下方的 PowerShell 终端。
+</w:t>
+      </w:r>
+    </w:p>
+    <w:p>
+      <w:pPr>
+        <w:spacing w:after="90" w:before="90" w:line="290"/>
+      </w:pPr>
+      <w:r>
+        <w:t xml:space="preserve">当前目录：web-work/p1-portfolio（自己的开发工程）
+</w:t>
+      </w:r>
+    </w:p>
+    <w:p>
+      <w:pPr>
+        <w:spacing w:after="90" w:before="90" w:line="290"/>
+      </w:pPr>
+      <w:r>
+        <w:t xml:space="preserve">运行方法：点击终端最后一行，粘贴本代码框并按 Enter；# 开头是注释，可以一起复制。看到预期结果后再做下一步。
+</w:t>
+      </w:r>
+    </w:p>
+    <w:p>
+      <w:pPr>
+        <w:shd w:fill="F1F5F8" w:val="clear"/>
+        <w:spacing w:after="0" w:before="0" w:line="240"/>
+        <w:ind w:left="120"/>
+      </w:pPr>
+      <w:r>
+        <w:rPr>
+          <w:rFonts w:ascii="Consolas" w:eastAsia="Microsoft YaHei" w:hAnsi="Consolas"/>
+          <w:color w:val="123F51"/>
+          <w:sz w:val="18"/>
+          <w:szCs w:val="18"/>
+        </w:rPr>
+        <w:t xml:space="preserve"># 显示引号内的问题；输入自己的信息后按回车，内容保存到左侧变量。
+</w:t>
+      </w:r>
+    </w:p>
+    <w:p>
+      <w:pPr>
         <w:shd w:fill="F1F5F8" w:val="clear"/>
         <w:spacing w:after="0" w:before="0" w:line="240"/>
         <w:ind w:left="120"/>
@@ -2022,6 +3174,50 @@
     </w:p>
     <w:p>
       <w:pPr>
+        <w:spacing w:after="90" w:before="90" w:line="290"/>
+      </w:pPr>
+      <w:r>
+        <w:t xml:space="preserve">运行平台：Windows 10/11 · PowerShell。输入位置：VS Code 下方的 PowerShell 终端。
+</w:t>
+      </w:r>
+    </w:p>
+    <w:p>
+      <w:pPr>
+        <w:spacing w:after="90" w:before="90" w:line="290"/>
+      </w:pPr>
+      <w:r>
+        <w:t xml:space="preserve">当前目录：web-work/p1-portfolio（自己的开发工程）
+</w:t>
+      </w:r>
+    </w:p>
+    <w:p>
+      <w:pPr>
+        <w:spacing w:after="90" w:before="90" w:line="290"/>
+      </w:pPr>
+      <w:r>
+        <w:t xml:space="preserve">运行方法：点击终端最后一行，粘贴本代码框并按 Enter；# 开头是注释，可以一起复制。看到预期结果后再做下一步。
+</w:t>
+      </w:r>
+    </w:p>
+    <w:p>
+      <w:pPr>
+        <w:shd w:fill="F1F5F8" w:val="clear"/>
+        <w:spacing w:after="0" w:before="0" w:line="240"/>
+        <w:ind w:left="120"/>
+      </w:pPr>
+      <w:r>
+        <w:rPr>
+          <w:rFonts w:ascii="Consolas" w:eastAsia="Microsoft YaHei" w:hAnsi="Consolas"/>
+          <w:color w:val="123F51"/>
+          <w:sz w:val="18"/>
+          <w:szCs w:val="18"/>
+        </w:rPr>
+        <w:t xml:space="preserve"># 显示引号内的问题；输入自己的信息后按回车，内容保存到左侧变量。
+</w:t>
+      </w:r>
+    </w:p>
+    <w:p>
+      <w:pPr>
         <w:shd w:fill="F1F5F8" w:val="clear"/>
         <w:spacing w:after="0" w:before="0" w:line="240"/>
         <w:ind w:left="120"/>
@@ -2057,6 +3253,50 @@
     </w:p>
     <w:p>
       <w:pPr>
+        <w:spacing w:after="90" w:before="90" w:line="290"/>
+      </w:pPr>
+      <w:r>
+        <w:t xml:space="preserve">运行平台：Windows 10/11 · PowerShell。输入位置：VS Code 下方的 PowerShell 终端。
+</w:t>
+      </w:r>
+    </w:p>
+    <w:p>
+      <w:pPr>
+        <w:spacing w:after="90" w:before="90" w:line="290"/>
+      </w:pPr>
+      <w:r>
+        <w:t xml:space="preserve">当前目录：web-work/p1-portfolio（自己的开发工程）
+</w:t>
+      </w:r>
+    </w:p>
+    <w:p>
+      <w:pPr>
+        <w:spacing w:after="90" w:before="90" w:line="290"/>
+      </w:pPr>
+      <w:r>
+        <w:t xml:space="preserve">运行方法：点击终端最后一行，粘贴本代码框并按 Enter；# 开头是注释，可以一起复制。看到预期结果后再做下一步。
+</w:t>
+      </w:r>
+    </w:p>
+    <w:p>
+      <w:pPr>
+        <w:shd w:fill="F1F5F8" w:val="clear"/>
+        <w:spacing w:after="0" w:before="0" w:line="240"/>
+        <w:ind w:left="120"/>
+      </w:pPr>
+      <w:r>
+        <w:rPr>
+          <w:rFonts w:ascii="Consolas" w:eastAsia="Microsoft YaHei" w:hAnsi="Consolas"/>
+          <w:color w:val="123F51"/>
+          <w:sz w:val="18"/>
+          <w:szCs w:val="18"/>
+        </w:rPr>
+        <w:t xml:space="preserve"># 设置当前仓库的提交署名，不是登录 GitHub。
+</w:t>
+      </w:r>
+    </w:p>
+    <w:p>
+      <w:pPr>
         <w:shd w:fill="F1F5F8" w:val="clear"/>
         <w:spacing w:after="0" w:before="0" w:line="240"/>
         <w:ind w:left="120"/>
@@ -2092,6 +3332,50 @@
     </w:p>
     <w:p>
       <w:pPr>
+        <w:spacing w:after="90" w:before="90" w:line="290"/>
+      </w:pPr>
+      <w:r>
+        <w:t xml:space="preserve">运行平台：Windows 10/11 · PowerShell。输入位置：VS Code 下方的 PowerShell 终端。
+</w:t>
+      </w:r>
+    </w:p>
+    <w:p>
+      <w:pPr>
+        <w:spacing w:after="90" w:before="90" w:line="290"/>
+      </w:pPr>
+      <w:r>
+        <w:t xml:space="preserve">当前目录：web-work/p1-portfolio（自己的开发工程）
+</w:t>
+      </w:r>
+    </w:p>
+    <w:p>
+      <w:pPr>
+        <w:spacing w:after="90" w:before="90" w:line="290"/>
+      </w:pPr>
+      <w:r>
+        <w:t xml:space="preserve">运行方法：点击终端最后一行，粘贴本代码框并按 Enter；# 开头是注释，可以一起复制。看到预期结果后再做下一步。
+</w:t>
+      </w:r>
+    </w:p>
+    <w:p>
+      <w:pPr>
+        <w:shd w:fill="F1F5F8" w:val="clear"/>
+        <w:spacing w:after="0" w:before="0" w:line="240"/>
+        <w:ind w:left="120"/>
+      </w:pPr>
+      <w:r>
+        <w:rPr>
+          <w:rFonts w:ascii="Consolas" w:eastAsia="Microsoft YaHei" w:hAnsi="Consolas"/>
+          <w:color w:val="123F51"/>
+          <w:sz w:val="18"/>
+          <w:szCs w:val="18"/>
+        </w:rPr>
+        <w:t xml:space="preserve"># 设置当前仓库的提交邮箱。
+</w:t>
+      </w:r>
+    </w:p>
+    <w:p>
+      <w:pPr>
         <w:shd w:fill="F1F5F8" w:val="clear"/>
         <w:spacing w:after="0" w:before="0" w:line="240"/>
         <w:ind w:left="120"/>
@@ -2127,6 +3411,50 @@
     </w:p>
     <w:p>
       <w:pPr>
+        <w:spacing w:after="90" w:before="90" w:line="290"/>
+      </w:pPr>
+      <w:r>
+        <w:t xml:space="preserve">运行平台：Windows 10/11 · PowerShell。输入位置：VS Code 下方的 PowerShell 终端。
+</w:t>
+      </w:r>
+    </w:p>
+    <w:p>
+      <w:pPr>
+        <w:spacing w:after="90" w:before="90" w:line="290"/>
+      </w:pPr>
+      <w:r>
+        <w:t xml:space="preserve">当前目录：web-work/p1-portfolio（自己的开发工程）
+</w:t>
+      </w:r>
+    </w:p>
+    <w:p>
+      <w:pPr>
+        <w:spacing w:after="90" w:before="90" w:line="290"/>
+      </w:pPr>
+      <w:r>
+        <w:t xml:space="preserve">运行方法：点击终端最后一行，粘贴本代码框并按 Enter；# 开头是注释，可以一起复制。看到预期结果后再做下一步。
+</w:t>
+      </w:r>
+    </w:p>
+    <w:p>
+      <w:pPr>
+        <w:shd w:fill="F1F5F8" w:val="clear"/>
+        <w:spacing w:after="0" w:before="0" w:line="240"/>
+        <w:ind w:left="120"/>
+      </w:pPr>
+      <w:r>
+        <w:rPr>
+          <w:rFonts w:ascii="Consolas" w:eastAsia="Microsoft YaHei" w:hAnsi="Consolas"/>
+          <w:color w:val="123F51"/>
+          <w:sz w:val="18"/>
+          <w:szCs w:val="18"/>
+        </w:rPr>
+        <w:t xml:space="preserve"># 查看未提交修改；short 或 porcelain 为简洁格式。
+</w:t>
+      </w:r>
+    </w:p>
+    <w:p>
+      <w:pPr>
         <w:shd w:fill="F1F5F8" w:val="clear"/>
         <w:spacing w:after="0" w:before="0" w:line="240"/>
         <w:ind w:left="120"/>
@@ -2162,6 +3490,50 @@
     </w:p>
     <w:p>
       <w:pPr>
+        <w:spacing w:after="90" w:before="90" w:line="290"/>
+      </w:pPr>
+      <w:r>
+        <w:t xml:space="preserve">运行平台：Windows 10/11 · PowerShell。输入位置：VS Code 下方的 PowerShell 终端。
+</w:t>
+      </w:r>
+    </w:p>
+    <w:p>
+      <w:pPr>
+        <w:spacing w:after="90" w:before="90" w:line="290"/>
+      </w:pPr>
+      <w:r>
+        <w:t xml:space="preserve">当前目录：web-work/p1-portfolio（自己的开发工程）
+</w:t>
+      </w:r>
+    </w:p>
+    <w:p>
+      <w:pPr>
+        <w:spacing w:after="90" w:before="90" w:line="290"/>
+      </w:pPr>
+      <w:r>
+        <w:t xml:space="preserve">运行方法：点击终端最后一行，粘贴本代码框并按 Enter；# 开头是注释，可以一起复制。看到预期结果后再做下一步。
+</w:t>
+      </w:r>
+    </w:p>
+    <w:p>
+      <w:pPr>
+        <w:shd w:fill="F1F5F8" w:val="clear"/>
+        <w:spacing w:after="0" w:before="0" w:line="240"/>
+        <w:ind w:left="120"/>
+      </w:pPr>
+      <w:r>
+        <w:rPr>
+          <w:rFonts w:ascii="Consolas" w:eastAsia="Microsoft YaHei" w:hAnsi="Consolas"/>
+          <w:color w:val="123F51"/>
+          <w:sz w:val="18"/>
+          <w:szCs w:val="18"/>
+        </w:rPr>
+        <w:t xml:space="preserve"># 查看逐行修改；出现分页界面时按 q 返回。
+</w:t>
+      </w:r>
+    </w:p>
+    <w:p>
+      <w:pPr>
         <w:shd w:fill="F1F5F8" w:val="clear"/>
         <w:spacing w:after="0" w:before="0" w:line="240"/>
         <w:ind w:left="120"/>
@@ -2197,6 +3569,50 @@
     </w:p>
     <w:p>
       <w:pPr>
+        <w:spacing w:after="90" w:before="90" w:line="290"/>
+      </w:pPr>
+      <w:r>
+        <w:t xml:space="preserve">运行平台：Windows 10/11 · PowerShell。输入位置：VS Code 下方的 PowerShell 终端。
+</w:t>
+      </w:r>
+    </w:p>
+    <w:p>
+      <w:pPr>
+        <w:spacing w:after="90" w:before="90" w:line="290"/>
+      </w:pPr>
+      <w:r>
+        <w:t xml:space="preserve">当前目录：web-work/p1-portfolio（自己的开发工程）
+</w:t>
+      </w:r>
+    </w:p>
+    <w:p>
+      <w:pPr>
+        <w:spacing w:after="90" w:before="90" w:line="290"/>
+      </w:pPr>
+      <w:r>
+        <w:t xml:space="preserve">运行方法：点击终端最后一行，粘贴本代码框并按 Enter；# 开头是注释，可以一起复制。看到预期结果后再做下一步。
+</w:t>
+      </w:r>
+    </w:p>
+    <w:p>
+      <w:pPr>
+        <w:shd w:fill="F1F5F8" w:val="clear"/>
+        <w:spacing w:after="0" w:before="0" w:line="240"/>
+        <w:ind w:left="120"/>
+      </w:pPr>
+      <w:r>
+        <w:rPr>
+          <w:rFonts w:ascii="Consolas" w:eastAsia="Microsoft YaHei" w:hAnsi="Consolas"/>
+          <w:color w:val="123F51"/>
+          <w:sz w:val="18"/>
+          <w:szCs w:val="18"/>
+        </w:rPr>
+        <w:t xml:space="preserve"># 把指定文件放入暂存区；点号表示当前工程内的变更。
+</w:t>
+      </w:r>
+    </w:p>
+    <w:p>
+      <w:pPr>
         <w:shd w:fill="F1F5F8" w:val="clear"/>
         <w:spacing w:after="0" w:before="0" w:line="240"/>
         <w:ind w:left="120"/>
@@ -2232,6 +3648,50 @@
     </w:p>
     <w:p>
       <w:pPr>
+        <w:spacing w:after="90" w:before="90" w:line="290"/>
+      </w:pPr>
+      <w:r>
+        <w:t xml:space="preserve">运行平台：Windows 10/11 · PowerShell。输入位置：VS Code 下方的 PowerShell 终端。
+</w:t>
+      </w:r>
+    </w:p>
+    <w:p>
+      <w:pPr>
+        <w:spacing w:after="90" w:before="90" w:line="290"/>
+      </w:pPr>
+      <w:r>
+        <w:t xml:space="preserve">当前目录：web-work/p1-portfolio（自己的开发工程）
+</w:t>
+      </w:r>
+    </w:p>
+    <w:p>
+      <w:pPr>
+        <w:spacing w:after="90" w:before="90" w:line="290"/>
+      </w:pPr>
+      <w:r>
+        <w:t xml:space="preserve">运行方法：点击终端最后一行，粘贴本代码框并按 Enter；# 开头是注释，可以一起复制。看到预期结果后再做下一步。
+</w:t>
+      </w:r>
+    </w:p>
+    <w:p>
+      <w:pPr>
+        <w:shd w:fill="F1F5F8" w:val="clear"/>
+        <w:spacing w:after="0" w:before="0" w:line="240"/>
+        <w:ind w:left="120"/>
+      </w:pPr>
+      <w:r>
+        <w:rPr>
+          <w:rFonts w:ascii="Consolas" w:eastAsia="Microsoft YaHei" w:hAnsi="Consolas"/>
+          <w:color w:val="123F51"/>
+          <w:sz w:val="18"/>
+          <w:szCs w:val="18"/>
+        </w:rPr>
+        <w:t xml:space="preserve"># 查看已经暂存、即将提交的文件摘要。
+</w:t>
+      </w:r>
+    </w:p>
+    <w:p>
+      <w:pPr>
         <w:shd w:fill="F1F5F8" w:val="clear"/>
         <w:spacing w:after="0" w:before="0" w:line="240"/>
         <w:ind w:left="120"/>
@@ -2267,6 +3727,50 @@
     </w:p>
     <w:p>
       <w:pPr>
+        <w:spacing w:after="90" w:before="90" w:line="290"/>
+      </w:pPr>
+      <w:r>
+        <w:t xml:space="preserve">运行平台：Windows 10/11 · PowerShell。输入位置：VS Code 下方的 PowerShell 终端。
+</w:t>
+      </w:r>
+    </w:p>
+    <w:p>
+      <w:pPr>
+        <w:spacing w:after="90" w:before="90" w:line="290"/>
+      </w:pPr>
+      <w:r>
+        <w:t xml:space="preserve">当前目录：web-work/p1-portfolio（自己的开发工程）
+</w:t>
+      </w:r>
+    </w:p>
+    <w:p>
+      <w:pPr>
+        <w:spacing w:after="90" w:before="90" w:line="290"/>
+      </w:pPr>
+      <w:r>
+        <w:t xml:space="preserve">运行方法：点击终端最后一行，粘贴本代码框并按 Enter；# 开头是注释，可以一起复制。看到预期结果后再做下一步。
+</w:t>
+      </w:r>
+    </w:p>
+    <w:p>
+      <w:pPr>
+        <w:shd w:fill="F1F5F8" w:val="clear"/>
+        <w:spacing w:after="0" w:before="0" w:line="240"/>
+        <w:ind w:left="120"/>
+      </w:pPr>
+      <w:r>
+        <w:rPr>
+          <w:rFonts w:ascii="Consolas" w:eastAsia="Microsoft YaHei" w:hAnsi="Consolas"/>
+          <w:color w:val="123F51"/>
+          <w:sz w:val="18"/>
+          <w:szCs w:val="18"/>
+        </w:rPr>
+        <w:t xml:space="preserve"># 把暂存内容保存为本地提交；-m 后面填写本次修改说明。
+</w:t>
+      </w:r>
+    </w:p>
+    <w:p>
+      <w:pPr>
         <w:shd w:fill="F1F5F8" w:val="clear"/>
         <w:spacing w:after="0" w:before="0" w:line="240"/>
         <w:ind w:left="120"/>
@@ -2302,6 +3806,50 @@
     </w:p>
     <w:p>
       <w:pPr>
+        <w:spacing w:after="90" w:before="90" w:line="290"/>
+      </w:pPr>
+      <w:r>
+        <w:t xml:space="preserve">运行平台：Windows 10/11 · PowerShell。输入位置：VS Code 下方的 PowerShell 终端。
+</w:t>
+      </w:r>
+    </w:p>
+    <w:p>
+      <w:pPr>
+        <w:spacing w:after="90" w:before="90" w:line="290"/>
+      </w:pPr>
+      <w:r>
+        <w:t xml:space="preserve">当前目录：web-work/p1-portfolio（自己的开发工程）
+</w:t>
+      </w:r>
+    </w:p>
+    <w:p>
+      <w:pPr>
+        <w:spacing w:after="90" w:before="90" w:line="290"/>
+      </w:pPr>
+      <w:r>
+        <w:t xml:space="preserve">运行方法：点击终端最后一行，粘贴本代码框并按 Enter；# 开头是注释，可以一起复制。看到预期结果后再做下一步。
+</w:t>
+      </w:r>
+    </w:p>
+    <w:p>
+      <w:pPr>
+        <w:shd w:fill="F1F5F8" w:val="clear"/>
+        <w:spacing w:after="0" w:before="0" w:line="240"/>
+        <w:ind w:left="120"/>
+      </w:pPr>
+      <w:r>
+        <w:rPr>
+          <w:rFonts w:ascii="Consolas" w:eastAsia="Microsoft YaHei" w:hAnsi="Consolas"/>
+          <w:color w:val="123F51"/>
+          <w:sz w:val="18"/>
+          <w:szCs w:val="18"/>
+        </w:rPr>
+        <w:t xml:space="preserve"># 查看提交历史；oneline 为简洁格式，graph 显示分支形状。
+</w:t>
+      </w:r>
+    </w:p>
+    <w:p>
+      <w:pPr>
         <w:shd w:fill="F1F5F8" w:val="clear"/>
         <w:spacing w:after="0" w:before="0" w:line="240"/>
         <w:ind w:left="120"/>
@@ -2349,7 +3897,51 @@
         <w:spacing w:after="90" w:before="90" w:line="290"/>
       </w:pPr>
       <w:r>
-        <w:t xml:space="preserve">位置：终端 B，p1-portfolio。
+        <w:t xml:space="preserve">位置：当前 PowerShell 终端，p1-portfolio。
+</w:t>
+      </w:r>
+    </w:p>
+    <w:p>
+      <w:pPr>
+        <w:spacing w:after="90" w:before="90" w:line="290"/>
+      </w:pPr>
+      <w:r>
+        <w:t xml:space="preserve">运行平台：Windows 10/11 · PowerShell。输入位置：VS Code 下方的 PowerShell 终端。
+</w:t>
+      </w:r>
+    </w:p>
+    <w:p>
+      <w:pPr>
+        <w:spacing w:after="90" w:before="90" w:line="290"/>
+      </w:pPr>
+      <w:r>
+        <w:t xml:space="preserve">当前目录：web-work/p1-portfolio（自己的开发工程）
+</w:t>
+      </w:r>
+    </w:p>
+    <w:p>
+      <w:pPr>
+        <w:spacing w:after="90" w:before="90" w:line="290"/>
+      </w:pPr>
+      <w:r>
+        <w:t xml:space="preserve">运行方法：点击终端最后一行，粘贴本代码框并按 Enter；# 开头是注释，可以一起复制。看到预期结果后再做下一步。
+</w:t>
+      </w:r>
+    </w:p>
+    <w:p>
+      <w:pPr>
+        <w:shd w:fill="F1F5F8" w:val="clear"/>
+        <w:spacing w:after="0" w:before="0" w:line="240"/>
+        <w:ind w:left="120"/>
+      </w:pPr>
+      <w:r>
+        <w:rPr>
+          <w:rFonts w:ascii="Consolas" w:eastAsia="Microsoft YaHei" w:hAnsi="Consolas"/>
+          <w:color w:val="123F51"/>
+          <w:sz w:val="18"/>
+          <w:szCs w:val="18"/>
+        </w:rPr>
+        <w:t xml:space="preserve"># 显示引号内的问题；输入自己的信息后按回车，内容保存到左侧变量。
 </w:t>
       </w:r>
     </w:p>
@@ -2381,6 +3973,50 @@
     </w:p>
     <w:p>
       <w:pPr>
+        <w:spacing w:after="90" w:before="90" w:line="290"/>
+      </w:pPr>
+      <w:r>
+        <w:t xml:space="preserve">运行平台：Windows 10/11 · PowerShell。输入位置：VS Code 下方的 PowerShell 终端。
+</w:t>
+      </w:r>
+    </w:p>
+    <w:p>
+      <w:pPr>
+        <w:spacing w:after="90" w:before="90" w:line="290"/>
+      </w:pPr>
+      <w:r>
+        <w:t xml:space="preserve">当前目录：web-work/p1-portfolio（自己的开发工程）
+</w:t>
+      </w:r>
+    </w:p>
+    <w:p>
+      <w:pPr>
+        <w:spacing w:after="90" w:before="90" w:line="290"/>
+      </w:pPr>
+      <w:r>
+        <w:t xml:space="preserve">运行方法：点击终端最后一行，粘贴本代码框并按 Enter；# 开头是注释，可以一起复制。看到预期结果后再做下一步。
+</w:t>
+      </w:r>
+    </w:p>
+    <w:p>
+      <w:pPr>
+        <w:shd w:fill="F1F5F8" w:val="clear"/>
+        <w:spacing w:after="0" w:before="0" w:line="240"/>
+        <w:ind w:left="120"/>
+      </w:pPr>
+      <w:r>
+        <w:rPr>
+          <w:rFonts w:ascii="Consolas" w:eastAsia="Microsoft YaHei" w:hAnsi="Consolas"/>
+          <w:color w:val="123F51"/>
+          <w:sz w:val="18"/>
+          <w:szCs w:val="18"/>
+        </w:rPr>
+        <w:t xml:space="preserve"># 首次把自己的远程仓库地址命名为 origin。
+</w:t>
+      </w:r>
+    </w:p>
+    <w:p>
+      <w:pPr>
         <w:shd w:fill="F1F5F8" w:val="clear"/>
         <w:spacing w:after="0" w:before="0" w:line="240"/>
         <w:ind w:left="120"/>
@@ -2407,6 +4043,50 @@
     </w:p>
     <w:p>
       <w:pPr>
+        <w:spacing w:after="90" w:before="90" w:line="290"/>
+      </w:pPr>
+      <w:r>
+        <w:t xml:space="preserve">运行平台：Windows 10/11 · PowerShell。输入位置：VS Code 下方的 PowerShell 终端。
+</w:t>
+      </w:r>
+    </w:p>
+    <w:p>
+      <w:pPr>
+        <w:spacing w:after="90" w:before="90" w:line="290"/>
+      </w:pPr>
+      <w:r>
+        <w:t xml:space="preserve">当前目录：web-work/p1-portfolio（自己的开发工程）
+</w:t>
+      </w:r>
+    </w:p>
+    <w:p>
+      <w:pPr>
+        <w:spacing w:after="90" w:before="90" w:line="290"/>
+      </w:pPr>
+      <w:r>
+        <w:t xml:space="preserve">运行方法：点击终端最后一行，粘贴本代码框并按 Enter；# 开头是注释，可以一起复制。看到预期结果后再做下一步。
+</w:t>
+      </w:r>
+    </w:p>
+    <w:p>
+      <w:pPr>
+        <w:shd w:fill="F1F5F8" w:val="clear"/>
+        <w:spacing w:after="0" w:before="0" w:line="240"/>
+        <w:ind w:left="120"/>
+      </w:pPr>
+      <w:r>
+        <w:rPr>
+          <w:rFonts w:ascii="Consolas" w:eastAsia="Microsoft YaHei" w:hAnsi="Consolas"/>
+          <w:color w:val="123F51"/>
+          <w:sz w:val="18"/>
+          <w:szCs w:val="18"/>
+        </w:rPr>
+        <w:t xml:space="preserve"># 显示远程地址，必须核对是否属于自己的成果仓库。
+</w:t>
+      </w:r>
+    </w:p>
+    <w:p>
+      <w:pPr>
         <w:shd w:fill="F1F5F8" w:val="clear"/>
         <w:spacing w:after="0" w:before="0" w:line="240"/>
         <w:ind w:left="120"/>
@@ -2442,6 +4122,50 @@
     </w:p>
     <w:p>
       <w:pPr>
+        <w:spacing w:after="90" w:before="90" w:line="290"/>
+      </w:pPr>
+      <w:r>
+        <w:t xml:space="preserve">运行平台：Windows 10/11 · PowerShell。输入位置：VS Code 下方的 PowerShell 终端。
+</w:t>
+      </w:r>
+    </w:p>
+    <w:p>
+      <w:pPr>
+        <w:spacing w:after="90" w:before="90" w:line="290"/>
+      </w:pPr>
+      <w:r>
+        <w:t xml:space="preserve">当前目录：web-work/p1-portfolio（自己的开发工程）
+</w:t>
+      </w:r>
+    </w:p>
+    <w:p>
+      <w:pPr>
+        <w:spacing w:after="90" w:before="90" w:line="290"/>
+      </w:pPr>
+      <w:r>
+        <w:t xml:space="preserve">运行方法：点击终端最后一行，粘贴本代码框并按 Enter；# 开头是注释，可以一起复制。看到预期结果后再做下一步。
+</w:t>
+      </w:r>
+    </w:p>
+    <w:p>
+      <w:pPr>
+        <w:shd w:fill="F1F5F8" w:val="clear"/>
+        <w:spacing w:after="0" w:before="0" w:line="240"/>
+        <w:ind w:left="120"/>
+      </w:pPr>
+      <w:r>
+        <w:rPr>
+          <w:rFonts w:ascii="Consolas" w:eastAsia="Microsoft YaHei" w:hAnsi="Consolas"/>
+          <w:color w:val="123F51"/>
+          <w:sz w:val="18"/>
+          <w:szCs w:val="18"/>
+        </w:rPr>
+        <w:t xml:space="preserve"># 把本地提交上传到自己的远程；-u 用于首次建立分支跟踪关系。
+</w:t>
+      </w:r>
+    </w:p>
+    <w:p>
+      <w:pPr>
         <w:shd w:fill="F1F5F8" w:val="clear"/>
         <w:spacing w:after="0" w:before="0" w:line="240"/>
         <w:ind w:left="120"/>
@@ -2543,7 +4267,51 @@
         <w:spacing w:after="90" w:before="90" w:line="290"/>
       </w:pPr>
       <w:r>
-        <w:t xml:space="preserve">在终端 B 也可以核对完整提交号：
+        <w:t xml:space="preserve">在当前 PowerShell 终端 也可以核对完整提交号：
+</w:t>
+      </w:r>
+    </w:p>
+    <w:p>
+      <w:pPr>
+        <w:spacing w:after="90" w:before="90" w:line="290"/>
+      </w:pPr>
+      <w:r>
+        <w:t xml:space="preserve">运行平台：Windows 10/11 · PowerShell。输入位置：VS Code 下方的 PowerShell 终端。
+</w:t>
+      </w:r>
+    </w:p>
+    <w:p>
+      <w:pPr>
+        <w:spacing w:after="90" w:before="90" w:line="290"/>
+      </w:pPr>
+      <w:r>
+        <w:t xml:space="preserve">当前目录：web-work/p1-portfolio（自己的开发工程）
+</w:t>
+      </w:r>
+    </w:p>
+    <w:p>
+      <w:pPr>
+        <w:spacing w:after="90" w:before="90" w:line="290"/>
+      </w:pPr>
+      <w:r>
+        <w:t xml:space="preserve">运行方法：点击终端最后一行，粘贴本代码框并按 Enter；# 开头是注释，可以一起复制。看到预期结果后再做下一步。
+</w:t>
+      </w:r>
+    </w:p>
+    <w:p>
+      <w:pPr>
+        <w:shd w:fill="F1F5F8" w:val="clear"/>
+        <w:spacing w:after="0" w:before="0" w:line="240"/>
+        <w:ind w:left="120"/>
+      </w:pPr>
+      <w:r>
+        <w:rPr>
+          <w:rFonts w:ascii="Consolas" w:eastAsia="Microsoft YaHei" w:hAnsi="Consolas"/>
+          <w:color w:val="123F51"/>
+          <w:sz w:val="18"/>
+          <w:szCs w:val="18"/>
+        </w:rPr>
+        <w:t xml:space="preserve"># 显示当前本地提交的完整编号。
 </w:t>
       </w:r>
     </w:p>
@@ -2575,6 +4343,50 @@
     </w:p>
     <w:p>
       <w:pPr>
+        <w:spacing w:after="90" w:before="90" w:line="290"/>
+      </w:pPr>
+      <w:r>
+        <w:t xml:space="preserve">运行平台：Windows 10/11 · PowerShell。输入位置：VS Code 下方的 PowerShell 终端。
+</w:t>
+      </w:r>
+    </w:p>
+    <w:p>
+      <w:pPr>
+        <w:spacing w:after="90" w:before="90" w:line="290"/>
+      </w:pPr>
+      <w:r>
+        <w:t xml:space="preserve">当前目录：web-work/p1-portfolio（自己的开发工程）
+</w:t>
+      </w:r>
+    </w:p>
+    <w:p>
+      <w:pPr>
+        <w:spacing w:after="90" w:before="90" w:line="290"/>
+      </w:pPr>
+      <w:r>
+        <w:t xml:space="preserve">运行方法：点击终端最后一行，粘贴本代码框并按 Enter；# 开头是注释，可以一起复制。看到预期结果后再做下一步。
+</w:t>
+      </w:r>
+    </w:p>
+    <w:p>
+      <w:pPr>
+        <w:shd w:fill="F1F5F8" w:val="clear"/>
+        <w:spacing w:after="0" w:before="0" w:line="240"/>
+        <w:ind w:left="120"/>
+      </w:pPr>
+      <w:r>
+        <w:rPr>
+          <w:rFonts w:ascii="Consolas" w:eastAsia="Microsoft YaHei" w:hAnsi="Consolas"/>
+          <w:color w:val="123F51"/>
+          <w:sz w:val="18"/>
+          <w:szCs w:val="18"/>
+        </w:rPr>
+        <w:t xml:space="preserve"># 查询远程指定分支的提交编号，用于和本地核对。
+</w:t>
+      </w:r>
+    </w:p>
+    <w:p>
+      <w:pPr>
         <w:shd w:fill="F1F5F8" w:val="clear"/>
         <w:spacing w:after="0" w:before="0" w:line="240"/>
         <w:ind w:left="120"/>
@@ -2631,7 +4443,51 @@
         <w:spacing w:after="90" w:before="90" w:line="290"/>
       </w:pPr>
       <w:r>
-        <w:t xml:space="preserve">以下命令都在 B 中依次执行：
+        <w:t xml:space="preserve">以下命令都在当前终端中依次执行：
+</w:t>
+      </w:r>
+    </w:p>
+    <w:p>
+      <w:pPr>
+        <w:spacing w:after="90" w:before="90" w:line="290"/>
+      </w:pPr>
+      <w:r>
+        <w:t xml:space="preserve">运行平台：Windows 10/11 · PowerShell。输入位置：VS Code 下方的 PowerShell 终端。
+</w:t>
+      </w:r>
+    </w:p>
+    <w:p>
+      <w:pPr>
+        <w:spacing w:after="90" w:before="90" w:line="290"/>
+      </w:pPr>
+      <w:r>
+        <w:t xml:space="preserve">当前目录：web-work/p1-portfolio（自己的开发工程）
+</w:t>
+      </w:r>
+    </w:p>
+    <w:p>
+      <w:pPr>
+        <w:spacing w:after="90" w:before="90" w:line="290"/>
+      </w:pPr>
+      <w:r>
+        <w:t xml:space="preserve">运行方法：点击终端最后一行，粘贴本代码框并按 Enter；# 开头是注释，可以一起复制。看到预期结果后再做下一步。
+</w:t>
+      </w:r>
+    </w:p>
+    <w:p>
+      <w:pPr>
+        <w:shd w:fill="F1F5F8" w:val="clear"/>
+        <w:spacing w:after="0" w:before="0" w:line="240"/>
+        <w:ind w:left="120"/>
+      </w:pPr>
+      <w:r>
+        <w:rPr>
+          <w:rFonts w:ascii="Consolas" w:eastAsia="Microsoft YaHei" w:hAnsi="Consolas"/>
+          <w:color w:val="123F51"/>
+          <w:sz w:val="18"/>
+          <w:szCs w:val="18"/>
+        </w:rPr>
+        <w:t xml:space="preserve"># 查看双横线后指定文件的变化。
 </w:t>
       </w:r>
     </w:p>
@@ -2663,6 +4519,50 @@
     </w:p>
     <w:p>
       <w:pPr>
+        <w:spacing w:after="90" w:before="90" w:line="290"/>
+      </w:pPr>
+      <w:r>
+        <w:t xml:space="preserve">运行平台：Windows 10/11 · PowerShell。输入位置：VS Code 下方的 PowerShell 终端。
+</w:t>
+      </w:r>
+    </w:p>
+    <w:p>
+      <w:pPr>
+        <w:spacing w:after="90" w:before="90" w:line="290"/>
+      </w:pPr>
+      <w:r>
+        <w:t xml:space="preserve">当前目录：web-work/p1-portfolio（自己的开发工程）
+</w:t>
+      </w:r>
+    </w:p>
+    <w:p>
+      <w:pPr>
+        <w:spacing w:after="90" w:before="90" w:line="290"/>
+      </w:pPr>
+      <w:r>
+        <w:t xml:space="preserve">运行方法：点击终端最后一行，粘贴本代码框并按 Enter；# 开头是注释，可以一起复制。看到预期结果后再做下一步。
+</w:t>
+      </w:r>
+    </w:p>
+    <w:p>
+      <w:pPr>
+        <w:shd w:fill="F1F5F8" w:val="clear"/>
+        <w:spacing w:after="0" w:before="0" w:line="240"/>
+        <w:ind w:left="120"/>
+      </w:pPr>
+      <w:r>
+        <w:rPr>
+          <w:rFonts w:ascii="Consolas" w:eastAsia="Microsoft YaHei" w:hAnsi="Consolas"/>
+          <w:color w:val="123F51"/>
+          <w:sz w:val="18"/>
+          <w:szCs w:val="18"/>
+        </w:rPr>
+        <w:t xml:space="preserve"># 把指定文件放入暂存区；点号表示当前工程内的变更。
+</w:t>
+      </w:r>
+    </w:p>
+    <w:p>
+      <w:pPr>
         <w:shd w:fill="F1F5F8" w:val="clear"/>
         <w:spacing w:after="0" w:before="0" w:line="240"/>
         <w:ind w:left="120"/>
@@ -2689,6 +4589,50 @@
     </w:p>
     <w:p>
       <w:pPr>
+        <w:spacing w:after="90" w:before="90" w:line="290"/>
+      </w:pPr>
+      <w:r>
+        <w:t xml:space="preserve">运行平台：Windows 10/11 · PowerShell。输入位置：VS Code 下方的 PowerShell 终端。
+</w:t>
+      </w:r>
+    </w:p>
+    <w:p>
+      <w:pPr>
+        <w:spacing w:after="90" w:before="90" w:line="290"/>
+      </w:pPr>
+      <w:r>
+        <w:t xml:space="preserve">当前目录：web-work/p1-portfolio（自己的开发工程）
+</w:t>
+      </w:r>
+    </w:p>
+    <w:p>
+      <w:pPr>
+        <w:spacing w:after="90" w:before="90" w:line="290"/>
+      </w:pPr>
+      <w:r>
+        <w:t xml:space="preserve">运行方法：点击终端最后一行，粘贴本代码框并按 Enter；# 开头是注释，可以一起复制。看到预期结果后再做下一步。
+</w:t>
+      </w:r>
+    </w:p>
+    <w:p>
+      <w:pPr>
+        <w:shd w:fill="F1F5F8" w:val="clear"/>
+        <w:spacing w:after="0" w:before="0" w:line="240"/>
+        <w:ind w:left="120"/>
+      </w:pPr>
+      <w:r>
+        <w:rPr>
+          <w:rFonts w:ascii="Consolas" w:eastAsia="Microsoft YaHei" w:hAnsi="Consolas"/>
+          <w:color w:val="123F51"/>
+          <w:sz w:val="18"/>
+          <w:szCs w:val="18"/>
+        </w:rPr>
+        <w:t xml:space="preserve"># 把暂存内容保存为本地提交；-m 后面填写本次修改说明。
+</w:t>
+      </w:r>
+    </w:p>
+    <w:p>
+      <w:pPr>
         <w:shd w:fill="F1F5F8" w:val="clear"/>
         <w:spacing w:after="0" w:before="0" w:line="240"/>
         <w:ind w:left="120"/>
@@ -2715,6 +4659,50 @@
     </w:p>
     <w:p>
       <w:pPr>
+        <w:spacing w:after="90" w:before="90" w:line="290"/>
+      </w:pPr>
+      <w:r>
+        <w:t xml:space="preserve">运行平台：Windows 10/11 · PowerShell。输入位置：VS Code 下方的 PowerShell 终端。
+</w:t>
+      </w:r>
+    </w:p>
+    <w:p>
+      <w:pPr>
+        <w:spacing w:after="90" w:before="90" w:line="290"/>
+      </w:pPr>
+      <w:r>
+        <w:t xml:space="preserve">当前目录：web-work/p1-portfolio（自己的开发工程）
+</w:t>
+      </w:r>
+    </w:p>
+    <w:p>
+      <w:pPr>
+        <w:spacing w:after="90" w:before="90" w:line="290"/>
+      </w:pPr>
+      <w:r>
+        <w:t xml:space="preserve">运行方法：点击终端最后一行，粘贴本代码框并按 Enter；# 开头是注释，可以一起复制。看到预期结果后再做下一步。
+</w:t>
+      </w:r>
+    </w:p>
+    <w:p>
+      <w:pPr>
+        <w:shd w:fill="F1F5F8" w:val="clear"/>
+        <w:spacing w:after="0" w:before="0" w:line="240"/>
+        <w:ind w:left="120"/>
+      </w:pPr>
+      <w:r>
+        <w:rPr>
+          <w:rFonts w:ascii="Consolas" w:eastAsia="Microsoft YaHei" w:hAnsi="Consolas"/>
+          <w:color w:val="123F51"/>
+          <w:sz w:val="18"/>
+          <w:szCs w:val="18"/>
+        </w:rPr>
+        <w:t xml:space="preserve"># 把本地提交上传到自己的远程；-u 用于首次建立分支跟踪关系。
+</w:t>
+      </w:r>
+    </w:p>
+    <w:p>
+      <w:pPr>
         <w:shd w:fill="F1F5F8" w:val="clear"/>
         <w:spacing w:after="0" w:before="0" w:line="240"/>
         <w:ind w:left="120"/>
@@ -2816,7 +4804,7 @@
         <w:spacing w:after="90" w:before="90" w:line="290"/>
       </w:pPr>
       <w:r>
-        <w:t xml:space="preserve">下次还是同一台电脑：打开 VS Code 中的 p1-portfolio，打开两个 PowerShell 终端；A 运行网页，B 做检查和 Git。不重做第一课的 init 和 remote add。换到下一课，使用下一课手册的备份、导入和个人内容恢复步骤。
+        <w:t xml:space="preserve">下次还是同一台电脑：打开 VS Code 中的 p1-portfolio，打开一个 PowerShell 终端，运行网页；需要检查和 Git 操作时先 Ctrl+C 停止网页。不重做第一课的 init 和 remote add。换到下一课，使用下一课手册的备份、导入和个人内容恢复步骤。
 </w:t>
       </w:r>
     </w:p>
@@ -2831,6 +4819,50 @@
     </w:p>
     <w:p>
       <w:pPr>
+        <w:spacing w:after="90" w:before="90" w:line="290"/>
+      </w:pPr>
+      <w:r>
+        <w:t xml:space="preserve">运行平台：Windows 10/11 · PowerShell。输入位置：VS Code 下方的 PowerShell 终端。
+</w:t>
+      </w:r>
+    </w:p>
+    <w:p>
+      <w:pPr>
+        <w:spacing w:after="90" w:before="90" w:line="290"/>
+      </w:pPr>
+      <w:r>
+        <w:t xml:space="preserve">当前目录：当前目录可以任意；本代码框会切换到指定目录。
+</w:t>
+      </w:r>
+    </w:p>
+    <w:p>
+      <w:pPr>
+        <w:spacing w:after="90" w:before="90" w:line="290"/>
+      </w:pPr>
+      <w:r>
+        <w:t xml:space="preserve">运行方法：点击终端最后一行，粘贴本代码框并按 Enter；# 开头是注释，可以一起复制。看到预期结果后再做下一步。
+</w:t>
+      </w:r>
+    </w:p>
+    <w:p>
+      <w:pPr>
+        <w:shd w:fill="F1F5F8" w:val="clear"/>
+        <w:spacing w:after="0" w:before="0" w:line="240"/>
+        <w:ind w:left="120"/>
+      </w:pPr>
+      <w:r>
+        <w:rPr>
+          <w:rFonts w:ascii="Consolas" w:eastAsia="Microsoft YaHei" w:hAnsi="Consolas"/>
+          <w:color w:val="123F51"/>
+          <w:sz w:val="18"/>
+          <w:szCs w:val="18"/>
+        </w:rPr>
+        <w:t xml:space="preserve"># 确定工作目录：本人 Windows 用户文件夹下的 web-work。
+</w:t>
+      </w:r>
+    </w:p>
+    <w:p>
+      <w:pPr>
         <w:shd w:fill="F1F5F8" w:val="clear"/>
         <w:spacing w:after="0" w:before="0" w:line="240"/>
         <w:ind w:left="120"/>
@@ -2859,6 +4891,23 @@
           <w:sz w:val="18"/>
           <w:szCs w:val="18"/>
         </w:rPr>
+        <w:t xml:space="preserve"># 创建工作文件夹；Directory 表示文件夹，Force 在这里允许复用已有目录。
+</w:t>
+      </w:r>
+    </w:p>
+    <w:p>
+      <w:pPr>
+        <w:shd w:fill="F1F5F8" w:val="clear"/>
+        <w:spacing w:after="0" w:before="0" w:line="240"/>
+        <w:ind w:left="120"/>
+      </w:pPr>
+      <w:r>
+        <w:rPr>
+          <w:rFonts w:ascii="Consolas" w:eastAsia="Microsoft YaHei" w:hAnsi="Consolas"/>
+          <w:color w:val="123F51"/>
+          <w:sz w:val="18"/>
+          <w:szCs w:val="18"/>
+        </w:rPr>
         <w:t xml:space="preserve">New-Item -ItemType Directory -Force -Path $workRoot
 </w:t>
       </w:r>
@@ -2876,6 +4925,23 @@
           <w:sz w:val="18"/>
           <w:szCs w:val="18"/>
         </w:rPr>
+        <w:t xml:space="preserve"># 进入指定文件夹，后面的命令将在这个目录里运行。
+</w:t>
+      </w:r>
+    </w:p>
+    <w:p>
+      <w:pPr>
+        <w:shd w:fill="F1F5F8" w:val="clear"/>
+        <w:spacing w:after="0" w:before="0" w:line="240"/>
+        <w:ind w:left="120"/>
+      </w:pPr>
+      <w:r>
+        <w:rPr>
+          <w:rFonts w:ascii="Consolas" w:eastAsia="Microsoft YaHei" w:hAnsi="Consolas"/>
+          <w:color w:val="123F51"/>
+          <w:sz w:val="18"/>
+          <w:szCs w:val="18"/>
+        </w:rPr>
         <w:t xml:space="preserve">Set-Location $workRoot
 </w:t>
       </w:r>
@@ -2891,6 +4957,50 @@
     </w:p>
     <w:p>
       <w:pPr>
+        <w:spacing w:after="90" w:before="90" w:line="290"/>
+      </w:pPr>
+      <w:r>
+        <w:t xml:space="preserve">运行平台：Windows 10/11 · PowerShell。输入位置：VS Code 下方的 PowerShell 终端。
+</w:t>
+      </w:r>
+    </w:p>
+    <w:p>
+      <w:pPr>
+        <w:spacing w:after="90" w:before="90" w:line="290"/>
+      </w:pPr>
+      <w:r>
+        <w:t xml:space="preserve">当前目录：本人用户目录下的 web-work
+</w:t>
+      </w:r>
+    </w:p>
+    <w:p>
+      <w:pPr>
+        <w:spacing w:after="90" w:before="90" w:line="290"/>
+      </w:pPr>
+      <w:r>
+        <w:t xml:space="preserve">运行方法：点击终端最后一行，粘贴本代码框并按 Enter；# 开头是注释，可以一起复制。看到预期结果后再做下一步。
+</w:t>
+      </w:r>
+    </w:p>
+    <w:p>
+      <w:pPr>
+        <w:shd w:fill="F1F5F8" w:val="clear"/>
+        <w:spacing w:after="0" w:before="0" w:line="240"/>
+        <w:ind w:left="120"/>
+      </w:pPr>
+      <w:r>
+        <w:rPr>
+          <w:rFonts w:ascii="Consolas" w:eastAsia="Microsoft YaHei" w:hAnsi="Consolas"/>
+          <w:color w:val="123F51"/>
+          <w:sz w:val="18"/>
+          <w:szCs w:val="18"/>
+        </w:rPr>
+        <w:t xml:space="preserve"># 显示引号内的问题；输入自己的信息后按回车，内容保存到左侧变量。
+</w:t>
+      </w:r>
+    </w:p>
+    <w:p>
+      <w:pPr>
         <w:shd w:fill="F1F5F8" w:val="clear"/>
         <w:spacing w:after="0" w:before="0" w:line="240"/>
         <w:ind w:left="120"/>
@@ -2917,6 +5027,50 @@
     </w:p>
     <w:p>
       <w:pPr>
+        <w:spacing w:after="90" w:before="90" w:line="290"/>
+      </w:pPr>
+      <w:r>
+        <w:t xml:space="preserve">运行平台：Windows 10/11 · PowerShell。输入位置：VS Code 下方的 PowerShell 终端。
+</w:t>
+      </w:r>
+    </w:p>
+    <w:p>
+      <w:pPr>
+        <w:spacing w:after="90" w:before="90" w:line="290"/>
+      </w:pPr>
+      <w:r>
+        <w:t xml:space="preserve">当前目录：本人用户目录下的 web-work
+</w:t>
+      </w:r>
+    </w:p>
+    <w:p>
+      <w:pPr>
+        <w:spacing w:after="90" w:before="90" w:line="290"/>
+      </w:pPr>
+      <w:r>
+        <w:t xml:space="preserve">运行方法：点击终端最后一行，粘贴本代码框并按 Enter；# 开头是注释，可以一起复制。看到预期结果后再做下一步。
+</w:t>
+      </w:r>
+    </w:p>
+    <w:p>
+      <w:pPr>
+        <w:shd w:fill="F1F5F8" w:val="clear"/>
+        <w:spacing w:after="0" w:before="0" w:line="240"/>
+        <w:ind w:left="120"/>
+      </w:pPr>
+      <w:r>
+        <w:rPr>
+          <w:rFonts w:ascii="Consolas" w:eastAsia="Microsoft YaHei" w:hAnsi="Consolas"/>
+          <w:color w:val="123F51"/>
+          <w:sz w:val="18"/>
+          <w:szCs w:val="18"/>
+        </w:rPr>
+        <w:t xml:space="preserve"># 从远程下载指定仓库或课次分支；最后一个参数是电脑上的保存文件夹。
+</w:t>
+      </w:r>
+    </w:p>
+    <w:p>
+      <w:pPr>
         <w:shd w:fill="F1F5F8" w:val="clear"/>
         <w:spacing w:after="0" w:before="0" w:line="240"/>
         <w:ind w:left="120"/>
@@ -2943,6 +5097,50 @@
     </w:p>
     <w:p>
       <w:pPr>
+        <w:spacing w:after="90" w:before="90" w:line="290"/>
+      </w:pPr>
+      <w:r>
+        <w:t xml:space="preserve">运行平台：Windows 10/11 · PowerShell。输入位置：VS Code 下方的 PowerShell 终端。
+</w:t>
+      </w:r>
+    </w:p>
+    <w:p>
+      <w:pPr>
+        <w:spacing w:after="90" w:before="90" w:line="290"/>
+      </w:pPr>
+      <w:r>
+        <w:t xml:space="preserve">当前目录：当前目录可以任意；本代码框会切换到指定目录。
+</w:t>
+      </w:r>
+    </w:p>
+    <w:p>
+      <w:pPr>
+        <w:spacing w:after="90" w:before="90" w:line="290"/>
+      </w:pPr>
+      <w:r>
+        <w:t xml:space="preserve">运行方法：点击终端最后一行，粘贴本代码框并按 Enter；# 开头是注释，可以一起复制。看到预期结果后再做下一步。
+</w:t>
+      </w:r>
+    </w:p>
+    <w:p>
+      <w:pPr>
+        <w:shd w:fill="F1F5F8" w:val="clear"/>
+        <w:spacing w:after="0" w:before="0" w:line="240"/>
+        <w:ind w:left="120"/>
+      </w:pPr>
+      <w:r>
+        <w:rPr>
+          <w:rFonts w:ascii="Consolas" w:eastAsia="Microsoft YaHei" w:hAnsi="Consolas"/>
+          <w:color w:val="123F51"/>
+          <w:sz w:val="18"/>
+          <w:szCs w:val="18"/>
+        </w:rPr>
+        <w:t xml:space="preserve"># 进入指定文件夹，后面的命令将在这个目录里运行。
+</w:t>
+      </w:r>
+    </w:p>
+    <w:p>
+      <w:pPr>
         <w:shd w:fill="F1F5F8" w:val="clear"/>
         <w:spacing w:after="0" w:before="0" w:line="240"/>
         <w:ind w:left="120"/>
@@ -2971,6 +5169,23 @@
           <w:sz w:val="18"/>
           <w:szCs w:val="18"/>
         </w:rPr>
+        <w:t xml:space="preserve"># 按照 package-lock.json 安装依赖，等待结束后再输入下一条命令。
+</w:t>
+      </w:r>
+    </w:p>
+    <w:p>
+      <w:pPr>
+        <w:shd w:fill="F1F5F8" w:val="clear"/>
+        <w:spacing w:after="0" w:before="0" w:line="240"/>
+        <w:ind w:left="120"/>
+      </w:pPr>
+      <w:r>
+        <w:rPr>
+          <w:rFonts w:ascii="Consolas" w:eastAsia="Microsoft YaHei" w:hAnsi="Consolas"/>
+          <w:color w:val="123F51"/>
+          <w:sz w:val="18"/>
+          <w:szCs w:val="18"/>
+        </w:rPr>
         <w:t xml:space="preserve">npm.cmd ci
 </w:t>
       </w:r>
@@ -2986,6 +5201,50 @@
     </w:p>
     <w:p>
       <w:pPr>
+        <w:spacing w:after="90" w:before="90" w:line="290"/>
+      </w:pPr>
+      <w:r>
+        <w:t xml:space="preserve">运行平台：Windows 10/11 · PowerShell。输入位置：VS Code 下方的 PowerShell 终端。
+</w:t>
+      </w:r>
+    </w:p>
+    <w:p>
+      <w:pPr>
+        <w:spacing w:after="90" w:before="90" w:line="290"/>
+      </w:pPr>
+      <w:r>
+        <w:t xml:space="preserve">当前目录：web-work/p1-portfolio（自己的开发工程）
+</w:t>
+      </w:r>
+    </w:p>
+    <w:p>
+      <w:pPr>
+        <w:spacing w:after="90" w:before="90" w:line="290"/>
+      </w:pPr>
+      <w:r>
+        <w:t xml:space="preserve">运行方法：点击终端最后一行，粘贴本代码框并按 Enter；# 开头是注释，可以一起复制。看到预期结果后再做下一步。
+</w:t>
+      </w:r>
+    </w:p>
+    <w:p>
+      <w:pPr>
+        <w:shd w:fill="F1F5F8" w:val="clear"/>
+        <w:spacing w:after="0" w:before="0" w:line="240"/>
+        <w:ind w:left="120"/>
+      </w:pPr>
+      <w:r>
+        <w:rPr>
+          <w:rFonts w:ascii="Consolas" w:eastAsia="Microsoft YaHei" w:hAnsi="Consolas"/>
+          <w:color w:val="123F51"/>
+          <w:sz w:val="18"/>
+          <w:szCs w:val="18"/>
+        </w:rPr>
+        <w:t xml:space="preserve"># 启动本地网页；持续运行时没有新的 PS 提示符是正常现象。
+</w:t>
+      </w:r>
+    </w:p>
+    <w:p>
+      <w:pPr>
         <w:shd w:fill="F1F5F8" w:val="clear"/>
         <w:spacing w:after="0" w:before="0" w:line="240"/>
         <w:ind w:left="120"/>
@@ -3039,6 +5298,50 @@
     </w:p>
     <w:p>
       <w:pPr>
+        <w:spacing w:after="90" w:before="90" w:line="290"/>
+      </w:pPr>
+      <w:r>
+        <w:t xml:space="preserve">运行平台：Windows 10/11 · PowerShell。输入位置：VS Code 下方的 PowerShell 终端。
+</w:t>
+      </w:r>
+    </w:p>
+    <w:p>
+      <w:pPr>
+        <w:spacing w:after="90" w:before="90" w:line="290"/>
+      </w:pPr>
+      <w:r>
+        <w:t xml:space="preserve">当前目录：当前目录可以任意；本代码框会切换到指定目录。
+</w:t>
+      </w:r>
+    </w:p>
+    <w:p>
+      <w:pPr>
+        <w:spacing w:after="90" w:before="90" w:line="290"/>
+      </w:pPr>
+      <w:r>
+        <w:t xml:space="preserve">运行方法：点击终端最后一行，粘贴本代码框并按 Enter；# 开头是注释，可以一起复制。看到预期结果后再做下一步。
+</w:t>
+      </w:r>
+    </w:p>
+    <w:p>
+      <w:pPr>
+        <w:shd w:fill="F1F5F8" w:val="clear"/>
+        <w:spacing w:after="0" w:before="0" w:line="240"/>
+        <w:ind w:left="120"/>
+      </w:pPr>
+      <w:r>
+        <w:rPr>
+          <w:rFonts w:ascii="Consolas" w:eastAsia="Microsoft YaHei" w:hAnsi="Consolas"/>
+          <w:color w:val="123F51"/>
+          <w:sz w:val="18"/>
+          <w:szCs w:val="18"/>
+        </w:rPr>
+        <w:t xml:space="preserve"># 进入指定文件夹，后面的命令将在这个目录里运行。
+</w:t>
+      </w:r>
+    </w:p>
+    <w:p>
+      <w:pPr>
         <w:shd w:fill="F1F5F8" w:val="clear"/>
         <w:spacing w:after="0" w:before="0" w:line="240"/>
         <w:ind w:left="120"/>
@@ -3067,6 +5370,23 @@
           <w:sz w:val="18"/>
           <w:szCs w:val="18"/>
         </w:rPr>
+        <w:t xml:space="preserve"># 检查路径是否存在，存在输出 True，不存在输出 False。
+</w:t>
+      </w:r>
+    </w:p>
+    <w:p>
+      <w:pPr>
+        <w:shd w:fill="F1F5F8" w:val="clear"/>
+        <w:spacing w:after="0" w:before="0" w:line="240"/>
+        <w:ind w:left="120"/>
+      </w:pPr>
+      <w:r>
+        <w:rPr>
+          <w:rFonts w:ascii="Consolas" w:eastAsia="Microsoft YaHei" w:hAnsi="Consolas"/>
+          <w:color w:val="123F51"/>
+          <w:sz w:val="18"/>
+          <w:szCs w:val="18"/>
+        </w:rPr>
         <w:t xml:space="preserve">Test-Path ./package.json
 </w:t>
       </w:r>
@@ -3094,7 +5414,7 @@
         <w:spacing w:after="90" w:before="90" w:line="290"/>
       </w:pPr>
       <w:r>
-        <w:t xml:space="preserve">先 Ctrl+S 保存，确认文件标签没有未保存圆点；再 Ctrl+R 刷新。确认地址是 A 的 Local 地址而不是远程 Pages。若 A 已关闭，重跑 npm.cmd run dev；如果提示 EADDRINUSE，找到自己之前的运行终端 Ctrl+C 停止，不随意结束其他程序。
+        <w:t xml:space="preserve">先 Ctrl+S 保存，确认文件标签没有未保存圆点；再 Ctrl+R 刷新。确认地址是 终端显示的 Local 地址而不是远程 Pages。若 运行终端已关闭，重跑 npm.cmd run dev；如果提示 EADDRINUSE，找到自己之前的运行终端 Ctrl+C 停止，不随意结束其他程序。
 </w:t>
       </w:r>
     </w:p>
@@ -3172,6 +5492,50 @@
     </w:p>
     <w:p>
       <w:pPr>
+        <w:spacing w:after="90" w:before="90" w:line="290"/>
+      </w:pPr>
+      <w:r>
+        <w:t xml:space="preserve">运行平台：Windows 10/11 · PowerShell。输入位置：VS Code 下方的 PowerShell 终端。
+</w:t>
+      </w:r>
+    </w:p>
+    <w:p>
+      <w:pPr>
+        <w:spacing w:after="90" w:before="90" w:line="290"/>
+      </w:pPr>
+      <w:r>
+        <w:t xml:space="preserve">当前目录：web-work/p1-portfolio（自己的开发工程）
+</w:t>
+      </w:r>
+    </w:p>
+    <w:p>
+      <w:pPr>
+        <w:spacing w:after="90" w:before="90" w:line="290"/>
+      </w:pPr>
+      <w:r>
+        <w:t xml:space="preserve">运行方法：点击终端最后一行，粘贴本代码框并按 Enter；# 开头是注释，可以一起复制。看到预期结果后再做下一步。
+</w:t>
+      </w:r>
+    </w:p>
+    <w:p>
+      <w:pPr>
+        <w:shd w:fill="F1F5F8" w:val="clear"/>
+        <w:spacing w:after="0" w:before="0" w:line="240"/>
+        <w:ind w:left="120"/>
+      </w:pPr>
+      <w:r>
+        <w:rPr>
+          <w:rFonts w:ascii="Consolas" w:eastAsia="Microsoft YaHei" w:hAnsi="Consolas"/>
+          <w:color w:val="123F51"/>
+          <w:sz w:val="18"/>
+          <w:szCs w:val="18"/>
+        </w:rPr>
+        <w:t xml:space="preserve"># 显示引号内的问题；输入自己的信息后按回车，内容保存到左侧变量。
+</w:t>
+      </w:r>
+    </w:p>
+    <w:p>
+      <w:pPr>
         <w:shd w:fill="F1F5F8" w:val="clear"/>
         <w:spacing w:after="0" w:before="0" w:line="240"/>
         <w:ind w:left="120"/>
@@ -3198,6 +5562,50 @@
     </w:p>
     <w:p>
       <w:pPr>
+        <w:spacing w:after="90" w:before="90" w:line="290"/>
+      </w:pPr>
+      <w:r>
+        <w:t xml:space="preserve">运行平台：Windows 10/11 · PowerShell。输入位置：VS Code 下方的 PowerShell 终端。
+</w:t>
+      </w:r>
+    </w:p>
+    <w:p>
+      <w:pPr>
+        <w:spacing w:after="90" w:before="90" w:line="290"/>
+      </w:pPr>
+      <w:r>
+        <w:t xml:space="preserve">当前目录：web-work/p1-portfolio（自己的开发工程）
+</w:t>
+      </w:r>
+    </w:p>
+    <w:p>
+      <w:pPr>
+        <w:spacing w:after="90" w:before="90" w:line="290"/>
+      </w:pPr>
+      <w:r>
+        <w:t xml:space="preserve">运行方法：点击终端最后一行，粘贴本代码框并按 Enter；# 开头是注释，可以一起复制。看到预期结果后再做下一步。
+</w:t>
+      </w:r>
+    </w:p>
+    <w:p>
+      <w:pPr>
+        <w:shd w:fill="F1F5F8" w:val="clear"/>
+        <w:spacing w:after="0" w:before="0" w:line="240"/>
+        <w:ind w:left="120"/>
+      </w:pPr>
+      <w:r>
+        <w:rPr>
+          <w:rFonts w:ascii="Consolas" w:eastAsia="Microsoft YaHei" w:hAnsi="Consolas"/>
+          <w:color w:val="123F51"/>
+          <w:sz w:val="18"/>
+          <w:szCs w:val="18"/>
+        </w:rPr>
+        <w:t xml:space="preserve"># 只在确认 origin 地址填错时修正，不改变本地历史。
+</w:t>
+      </w:r>
+    </w:p>
+    <w:p>
+      <w:pPr>
         <w:shd w:fill="F1F5F8" w:val="clear"/>
         <w:spacing w:after="0" w:before="0" w:line="240"/>
         <w:ind w:left="120"/>
@@ -3224,6 +5632,50 @@
     </w:p>
     <w:p>
       <w:pPr>
+        <w:spacing w:after="90" w:before="90" w:line="290"/>
+      </w:pPr>
+      <w:r>
+        <w:t xml:space="preserve">运行平台：Windows 10/11 · PowerShell。输入位置：VS Code 下方的 PowerShell 终端。
+</w:t>
+      </w:r>
+    </w:p>
+    <w:p>
+      <w:pPr>
+        <w:spacing w:after="90" w:before="90" w:line="290"/>
+      </w:pPr>
+      <w:r>
+        <w:t xml:space="preserve">当前目录：web-work/p1-portfolio（自己的开发工程）
+</w:t>
+      </w:r>
+    </w:p>
+    <w:p>
+      <w:pPr>
+        <w:spacing w:after="90" w:before="90" w:line="290"/>
+      </w:pPr>
+      <w:r>
+        <w:t xml:space="preserve">运行方法：点击终端最后一行，粘贴本代码框并按 Enter；# 开头是注释，可以一起复制。看到预期结果后再做下一步。
+</w:t>
+      </w:r>
+    </w:p>
+    <w:p>
+      <w:pPr>
+        <w:shd w:fill="F1F5F8" w:val="clear"/>
+        <w:spacing w:after="0" w:before="0" w:line="240"/>
+        <w:ind w:left="120"/>
+      </w:pPr>
+      <w:r>
+        <w:rPr>
+          <w:rFonts w:ascii="Consolas" w:eastAsia="Microsoft YaHei" w:hAnsi="Consolas"/>
+          <w:color w:val="123F51"/>
+          <w:sz w:val="18"/>
+          <w:szCs w:val="18"/>
+        </w:rPr>
+        <w:t xml:space="preserve"># 显示远程地址，必须核对是否属于自己的成果仓库。
+</w:t>
+      </w:r>
+    </w:p>
+    <w:p>
+      <w:pPr>
         <w:shd w:fill="F1F5F8" w:val="clear"/>
         <w:spacing w:after="0" w:before="0" w:line="240"/>
         <w:ind w:left="120"/>
@@ -3268,6 +5720,50 @@
     </w:p>
     <w:p>
       <w:pPr>
+        <w:spacing w:after="90" w:before="90" w:line="290"/>
+      </w:pPr>
+      <w:r>
+        <w:t xml:space="preserve">运行平台：Windows 10/11 · PowerShell。输入位置：VS Code 下方的 PowerShell 终端。
+</w:t>
+      </w:r>
+    </w:p>
+    <w:p>
+      <w:pPr>
+        <w:spacing w:after="90" w:before="90" w:line="290"/>
+      </w:pPr>
+      <w:r>
+        <w:t xml:space="preserve">当前目录：web-work/p1-portfolio（自己的开发工程）
+</w:t>
+      </w:r>
+    </w:p>
+    <w:p>
+      <w:pPr>
+        <w:spacing w:after="90" w:before="90" w:line="290"/>
+      </w:pPr>
+      <w:r>
+        <w:t xml:space="preserve">运行方法：点击终端最后一行，粘贴本代码框并按 Enter；# 开头是注释，可以一起复制。看到预期结果后再做下一步。
+</w:t>
+      </w:r>
+    </w:p>
+    <w:p>
+      <w:pPr>
+        <w:shd w:fill="F1F5F8" w:val="clear"/>
+        <w:spacing w:after="0" w:before="0" w:line="240"/>
+        <w:ind w:left="120"/>
+      </w:pPr>
+      <w:r>
+        <w:rPr>
+          <w:rFonts w:ascii="Consolas" w:eastAsia="Microsoft YaHei" w:hAnsi="Consolas"/>
+          <w:color w:val="123F51"/>
+          <w:sz w:val="18"/>
+          <w:szCs w:val="18"/>
+        </w:rPr>
+        <w:t xml:space="preserve"># 检查 Git Credential Manager 是否安装。
+</w:t>
+      </w:r>
+    </w:p>
+    <w:p>
+      <w:pPr>
         <w:shd w:fill="F1F5F8" w:val="clear"/>
         <w:spacing w:after="0" w:before="0" w:line="240"/>
         <w:ind w:left="120"/>
@@ -3294,6 +5790,50 @@
     </w:p>
     <w:p>
       <w:pPr>
+        <w:spacing w:after="90" w:before="90" w:line="290"/>
+      </w:pPr>
+      <w:r>
+        <w:t xml:space="preserve">运行平台：Windows 10/11 · PowerShell。输入位置：VS Code 下方的 PowerShell 终端。
+</w:t>
+      </w:r>
+    </w:p>
+    <w:p>
+      <w:pPr>
+        <w:spacing w:after="90" w:before="90" w:line="290"/>
+      </w:pPr>
+      <w:r>
+        <w:t xml:space="preserve">当前目录：web-work/p1-portfolio（自己的开发工程）
+</w:t>
+      </w:r>
+    </w:p>
+    <w:p>
+      <w:pPr>
+        <w:spacing w:after="90" w:before="90" w:line="290"/>
+      </w:pPr>
+      <w:r>
+        <w:t xml:space="preserve">运行方法：点击终端最后一行，粘贴本代码框并按 Enter；# 开头是注释，可以一起复制。看到预期结果后再做下一步。
+</w:t>
+      </w:r>
+    </w:p>
+    <w:p>
+      <w:pPr>
+        <w:shd w:fill="F1F5F8" w:val="clear"/>
+        <w:spacing w:after="0" w:before="0" w:line="240"/>
+        <w:ind w:left="120"/>
+      </w:pPr>
+      <w:r>
+        <w:rPr>
+          <w:rFonts w:ascii="Consolas" w:eastAsia="Microsoft YaHei" w:hAnsi="Consolas"/>
+          <w:color w:val="123F51"/>
+          <w:sz w:val="18"/>
+          <w:szCs w:val="18"/>
+        </w:rPr>
+        <w:t xml:space="preserve"># 显示凭据助手的配置来源，不显示密码。
+</w:t>
+      </w:r>
+    </w:p>
+    <w:p>
+      <w:pPr>
         <w:shd w:fill="F1F5F8" w:val="clear"/>
         <w:spacing w:after="0" w:before="0" w:line="240"/>
         <w:ind w:left="120"/>
@@ -3338,6 +5878,50 @@
     </w:p>
     <w:p>
       <w:pPr>
+        <w:spacing w:after="90" w:before="90" w:line="290"/>
+      </w:pPr>
+      <w:r>
+        <w:t xml:space="preserve">运行平台：Windows 10/11 · PowerShell。输入位置：VS Code 下方的 PowerShell 终端。
+</w:t>
+      </w:r>
+    </w:p>
+    <w:p>
+      <w:pPr>
+        <w:spacing w:after="90" w:before="90" w:line="290"/>
+      </w:pPr>
+      <w:r>
+        <w:t xml:space="preserve">当前目录：web-work/p1-portfolio（自己的开发工程）
+</w:t>
+      </w:r>
+    </w:p>
+    <w:p>
+      <w:pPr>
+        <w:spacing w:after="90" w:before="90" w:line="290"/>
+      </w:pPr>
+      <w:r>
+        <w:t xml:space="preserve">运行方法：点击终端最后一行，粘贴本代码框并按 Enter；# 开头是注释，可以一起复制。看到预期结果后再做下一步。
+</w:t>
+      </w:r>
+    </w:p>
+    <w:p>
+      <w:pPr>
+        <w:shd w:fill="F1F5F8" w:val="clear"/>
+        <w:spacing w:after="0" w:before="0" w:line="240"/>
+        <w:ind w:left="120"/>
+      </w:pPr>
+      <w:r>
+        <w:rPr>
+          <w:rFonts w:ascii="Consolas" w:eastAsia="Microsoft YaHei" w:hAnsi="Consolas"/>
+          <w:color w:val="123F51"/>
+          <w:sz w:val="18"/>
+          <w:szCs w:val="18"/>
+        </w:rPr>
+        <w:t xml:space="preserve"># 取回远程历史用于比较，不覆盖当前工作文件。
+</w:t>
+      </w:r>
+    </w:p>
+    <w:p>
+      <w:pPr>
         <w:shd w:fill="F1F5F8" w:val="clear"/>
         <w:spacing w:after="0" w:before="0" w:line="240"/>
         <w:ind w:left="120"/>
@@ -3359,6 +5943,50 @@
       </w:pPr>
       <w:r>
         <w:t xml:space="preserve">命令解释：取回远程历史供比较，不覆盖当前工作文件。
+</w:t>
+      </w:r>
+    </w:p>
+    <w:p>
+      <w:pPr>
+        <w:spacing w:after="90" w:before="90" w:line="290"/>
+      </w:pPr>
+      <w:r>
+        <w:t xml:space="preserve">运行平台：Windows 10/11 · PowerShell。输入位置：VS Code 下方的 PowerShell 终端。
+</w:t>
+      </w:r>
+    </w:p>
+    <w:p>
+      <w:pPr>
+        <w:spacing w:after="90" w:before="90" w:line="290"/>
+      </w:pPr>
+      <w:r>
+        <w:t xml:space="preserve">当前目录：web-work/p1-portfolio（自己的开发工程）
+</w:t>
+      </w:r>
+    </w:p>
+    <w:p>
+      <w:pPr>
+        <w:spacing w:after="90" w:before="90" w:line="290"/>
+      </w:pPr>
+      <w:r>
+        <w:t xml:space="preserve">运行方法：点击终端最后一行，粘贴本代码框并按 Enter；# 开头是注释，可以一起复制。看到预期结果后再做下一步。
+</w:t>
+      </w:r>
+    </w:p>
+    <w:p>
+      <w:pPr>
+        <w:shd w:fill="F1F5F8" w:val="clear"/>
+        <w:spacing w:after="0" w:before="0" w:line="240"/>
+        <w:ind w:left="120"/>
+      </w:pPr>
+      <w:r>
+        <w:rPr>
+          <w:rFonts w:ascii="Consolas" w:eastAsia="Microsoft YaHei" w:hAnsi="Consolas"/>
+          <w:color w:val="123F51"/>
+          <w:sz w:val="18"/>
+          <w:szCs w:val="18"/>
+        </w:rPr>
+        <w:t xml:space="preserve"># 查看提交历史；oneline 为简洁格式，graph 显示分支形状。
 </w:t>
       </w:r>
     </w:p>
@@ -3441,7 +6069,7 @@
           <w:numId w:val="2"/>
         </w:numPr>
       </w:pPr>
-      <w:hyperlink w:history="1" r:id="rIdenegyrdenlccrit_b7gfc">
+      <w:hyperlink w:history="1" r:id="rIdx2chltam5ojmeataklwq5">
         <w:r>
           <w:rPr>
             <w:rStyle w:val="Hyperlink"/>
@@ -3462,7 +6090,7 @@
           <w:numId w:val="2"/>
         </w:numPr>
       </w:pPr>
-      <w:hyperlink w:history="1" r:id="rIddah9xu4b5ar6-a28s1ai3">
+      <w:hyperlink w:history="1" r:id="rIdtl6-6xlrl9ftcpidmgncr">
         <w:r>
           <w:rPr>
             <w:rStyle w:val="Hyperlink"/>
@@ -3483,7 +6111,7 @@
           <w:numId w:val="2"/>
         </w:numPr>
       </w:pPr>
-      <w:hyperlink w:history="1" r:id="rIdrq5qsomhjftuugqhl_kgz">
+      <w:hyperlink w:history="1" r:id="rIdppipc8lmx_gr9ok-ytr_7">
         <w:r>
           <w:rPr>
             <w:rStyle w:val="Hyperlink"/>

</xml_diff>